<commit_message>
docs: rewrite framework documents with plain-language explanations
Both EN and NL versions now include gray "In plain terms" / "Wat
betekent dit?" explanation boxes after every technical section.
Analogies (weather forecast, school exam, two experts) make concepts
accessible to non-technical stakeholders and regulators.

Co-Authored-By: Claude Opus 4.6 (1M context) <noreply@anthropic.com>
</commit_message>
<xml_diff>
--- a/docs/BetsPlug-Technical-Legal-Framework.docx
+++ b/docs/BetsPlug-Technical-Legal-Framework.docx
@@ -161,28 +161,41 @@
     </w:p>
     <w:p>
       <w:pPr>
-        <w:spacing w:after="120"/>
-      </w:pPr>
-      <w:r>
-        <w:rPr>
-          <w:rFonts w:ascii="Arial" w:cs="Arial" w:eastAsia="Arial" w:hAnsi="Arial"/>
-          <w:sz w:val="22"/>
-          <w:szCs w:val="22"/>
-        </w:rPr>
-        <w:t xml:space="preserve">BetsPlug is an AI-driven football prediction platform designed exclusively for educational and simulation purposes. The platform does NOT facilitate gambling, accept wagers, or process betting transactions. All predictions are clearly labeled as simulations with mandatory disclaimers displayed on every output.</w:t>
-      </w:r>
-    </w:p>
-    <w:p>
-      <w:pPr>
-        <w:spacing w:after="120"/>
-      </w:pPr>
-      <w:r>
-        <w:rPr>
-          <w:rFonts w:ascii="Arial" w:cs="Arial" w:eastAsia="Arial" w:hAnsi="Arial"/>
-          <w:sz w:val="22"/>
-          <w:szCs w:val="22"/>
-        </w:rPr>
-        <w:t xml:space="preserve">The prediction engine uses a statistically validated ensemble of mathematical models, rigorously evaluated against historical data with strict temporal separation between training and validation periods. A grid search across 1,295 weight configurations confirmed the optimal model setup, validated on out-of-sample 2026 data.</w:t>
+        <w:spacing w:after="140" w:line="320"/>
+      </w:pPr>
+      <w:r>
+        <w:rPr>
+          <w:rFonts w:ascii="Arial" w:cs="Arial" w:eastAsia="Arial" w:hAnsi="Arial"/>
+          <w:sz w:val="22"/>
+          <w:szCs w:val="22"/>
+        </w:rPr>
+        <w:t xml:space="preserve">BetsPlug is an online platform that uses artificial intelligence (AI) to predict the outcomes of football matches. The platform is designed exclusively for educational and informational purposes. BetsPlug does not organise gambling activities, accept wagers, or process any betting transactions.</w:t>
+      </w:r>
+    </w:p>
+    <w:p>
+      <w:pPr>
+        <w:spacing w:after="140" w:line="320"/>
+      </w:pPr>
+      <w:r>
+        <w:rPr>
+          <w:rFonts w:ascii="Arial" w:cs="Arial" w:eastAsia="Arial" w:hAnsi="Arial"/>
+          <w:sz w:val="22"/>
+          <w:szCs w:val="22"/>
+        </w:rPr>
+        <w:t xml:space="preserve">The system analyses years of match data — including results, team form, head-to-head records, and league standings — to estimate the most likely outcome of upcoming matches. Every prediction is accompanied by a clear notice that it is a simulation and does not guarantee any profit.</w:t>
+      </w:r>
+    </w:p>
+    <w:p>
+      <w:pPr>
+        <w:spacing w:after="140" w:line="320"/>
+      </w:pPr>
+      <w:r>
+        <w:rPr>
+          <w:rFonts w:ascii="Arial" w:cs="Arial" w:eastAsia="Arial" w:hAnsi="Arial"/>
+          <w:sz w:val="22"/>
+          <w:szCs w:val="22"/>
+        </w:rPr>
+        <w:t xml:space="preserve">To demonstrate the system’s reliability, it has been extensively tested: 1,295 different configurations were evaluated on over 6,500 historical matches. The results on data the system had never seen before (the year 2026) closely match the results on training data — confirming the system works reliably and is not “overfitted” (too specifically tuned to historical data).</w:t>
       </w:r>
     </w:p>
     <w:p>
@@ -199,7 +212,20 @@
           <w:sz w:val="32"/>
           <w:szCs w:val="32"/>
         </w:rPr>
-        <w:t xml:space="preserve">2. Platform Overview</w:t>
+        <w:t xml:space="preserve">2. What is BetsPlug?</w:t>
+      </w:r>
+    </w:p>
+    <w:p>
+      <w:pPr>
+        <w:spacing w:after="140" w:line="320"/>
+      </w:pPr>
+      <w:r>
+        <w:rPr>
+          <w:rFonts w:ascii="Arial" w:cs="Arial" w:eastAsia="Arial" w:hAnsi="Arial"/>
+          <w:sz w:val="22"/>
+          <w:szCs w:val="22"/>
+        </w:rPr>
+        <w:t xml:space="preserve">BetsPlug is a web application where users can log in to view AI-generated football predictions. The platform operates as a subscription service with different tiers:</w:t>
       </w:r>
     </w:p>
     <w:tbl>
@@ -275,7 +301,7 @@
                 <w:sz w:val="20"/>
                 <w:szCs w:val="20"/>
               </w:rPr>
-              <w:t xml:space="preserve">Details</w:t>
+              <w:t xml:space="preserve">Explanation</w:t>
             </w:r>
           </w:p>
         </w:tc>
@@ -307,7 +333,7 @@
                 <w:sz w:val="20"/>
                 <w:szCs w:val="20"/>
               </w:rPr>
-              <w:t xml:space="preserve">Architecture</w:t>
+              <w:t xml:space="preserve">Free tier</w:t>
             </w:r>
           </w:p>
         </w:tc>
@@ -337,7 +363,7 @@
                 <w:sz w:val="20"/>
                 <w:szCs w:val="20"/>
               </w:rPr>
-              <w:t xml:space="preserve">Next.js 14 frontend, FastAPI (Python) backend</w:t>
+              <w:t xml:space="preserve">Limited access: 3 daily predictions, basic statistics</w:t>
             </w:r>
           </w:p>
         </w:tc>
@@ -369,7 +395,7 @@
                 <w:sz w:val="20"/>
                 <w:szCs w:val="20"/>
               </w:rPr>
-              <w:t xml:space="preserve">Subscription Tiers</w:t>
+              <w:t xml:space="preserve">Silver / Gold / Platinum</w:t>
             </w:r>
           </w:p>
         </w:tc>
@@ -399,7 +425,7 @@
                 <w:sz w:val="20"/>
                 <w:szCs w:val="20"/>
               </w:rPr>
-              <w:t xml:space="preserve">Free, Silver, Gold, Platinum</w:t>
+              <w:t xml:space="preserve">Full access: all predictions, track record, exports, Pick of the Day</w:t>
             </w:r>
           </w:p>
         </w:tc>
@@ -431,7 +457,7 @@
                 <w:sz w:val="20"/>
                 <w:szCs w:val="20"/>
               </w:rPr>
-              <w:t xml:space="preserve">League Coverage</w:t>
+              <w:t xml:space="preserve">League coverage</w:t>
             </w:r>
           </w:p>
         </w:tc>
@@ -461,7 +487,7 @@
                 <w:sz w:val="20"/>
                 <w:szCs w:val="20"/>
               </w:rPr>
-              <w:t xml:space="preserve">24 football leagues worldwide</w:t>
+              <w:t xml:space="preserve">24 football leagues worldwide, including Premier League, Champions League, Eredivisie</w:t>
             </w:r>
           </w:p>
         </w:tc>
@@ -493,7 +519,7 @@
                 <w:sz w:val="20"/>
                 <w:szCs w:val="20"/>
               </w:rPr>
-              <w:t xml:space="preserve">Data Sources</w:t>
+              <w:t xml:space="preserve">Data sources</w:t>
             </w:r>
           </w:p>
         </w:tc>
@@ -523,7 +549,7 @@
                 <w:sz w:val="20"/>
                 <w:szCs w:val="20"/>
               </w:rPr>
-              <w:t xml:space="preserve">API-Football (Pro), Football-Data.org, The Odds API</w:t>
+              <w:t xml:space="preserve">Professional sports data APIs (API-Football, Football-Data.org, The Odds API)</w:t>
             </w:r>
           </w:p>
         </w:tc>
@@ -555,7 +581,7 @@
                 <w:sz w:val="20"/>
                 <w:szCs w:val="20"/>
               </w:rPr>
-              <w:t xml:space="preserve">Infrastructure</w:t>
+              <w:t xml:space="preserve">Payments</w:t>
             </w:r>
           </w:p>
         </w:tc>
@@ -585,74 +611,39 @@
                 <w:sz w:val="20"/>
                 <w:szCs w:val="20"/>
               </w:rPr>
-              <w:t xml:space="preserve">Railway (backend), Vercel (frontend), PostgreSQL, Redis</w:t>
-            </w:r>
-          </w:p>
-        </w:tc>
-      </w:tr>
-      <w:tr>
-        <w:tc>
-          <w:tcPr>
-            <w:tcW w:type="dxa" w:w="4500"/>
-            <w:tcBorders>
-              <w:top w:val="single" w:color="cccccc" w:sz="1"/>
-              <w:left w:val="single" w:color="cccccc" w:sz="1"/>
-              <w:bottom w:val="single" w:color="cccccc" w:sz="1"/>
-              <w:right w:val="single" w:color="cccccc" w:sz="1"/>
-            </w:tcBorders>
-            <w:shd w:fill="ffffff" w:val="clear"/>
-            <w:tcMar>
-              <w:top w:type="dxa" w:w="80"/>
-              <w:left w:type="dxa" w:w="120"/>
-              <w:bottom w:type="dxa" w:w="80"/>
-              <w:right w:type="dxa" w:w="120"/>
-            </w:tcMar>
-          </w:tcPr>
-          <w:p>
-            <w:r>
-              <w:rPr>
-                <w:rFonts w:ascii="Arial" w:cs="Arial" w:eastAsia="Arial" w:hAnsi="Arial"/>
-                <w:b w:val="false"/>
-                <w:bCs w:val="false"/>
-                <w:sz w:val="20"/>
-                <w:szCs w:val="20"/>
-              </w:rPr>
-              <w:t xml:space="preserve">Payments</w:t>
-            </w:r>
-          </w:p>
-        </w:tc>
-        <w:tc>
-          <w:tcPr>
-            <w:tcW w:type="dxa" w:w="4526"/>
-            <w:tcBorders>
-              <w:top w:val="single" w:color="cccccc" w:sz="1"/>
-              <w:left w:val="single" w:color="cccccc" w:sz="1"/>
-              <w:bottom w:val="single" w:color="cccccc" w:sz="1"/>
-              <w:right w:val="single" w:color="cccccc" w:sz="1"/>
-            </w:tcBorders>
-            <w:shd w:fill="ffffff" w:val="clear"/>
-            <w:tcMar>
-              <w:top w:type="dxa" w:w="80"/>
-              <w:left w:type="dxa" w:w="120"/>
-              <w:bottom w:type="dxa" w:w="80"/>
-              <w:right w:type="dxa" w:w="120"/>
-            </w:tcMar>
-          </w:tcPr>
-          <w:p>
-            <w:r>
-              <w:rPr>
-                <w:rFonts w:ascii="Arial" w:cs="Arial" w:eastAsia="Arial" w:hAnsi="Arial"/>
-                <w:b w:val="false"/>
-                <w:bCs w:val="false"/>
-                <w:sz w:val="20"/>
-                <w:szCs w:val="20"/>
-              </w:rPr>
-              <w:t xml:space="preserve">Stripe (PCI-DSS compliant, no card data stored)</w:t>
+              <w:t xml:space="preserve">Via Stripe — BetsPlug does not store any credit card information</w:t>
             </w:r>
           </w:p>
         </w:tc>
       </w:tr>
     </w:tbl>
+    <w:p>
+      <w:pPr>
+        <w:shd w:fill="f5f5f5" w:val="clear"/>
+        <w:spacing w:after="160" w:before="80" w:line="320"/>
+        <w:ind w:left="200" w:right="200"/>
+      </w:pPr>
+      <w:r>
+        <w:rPr>
+          <w:rFonts w:ascii="Arial" w:cs="Arial" w:eastAsia="Arial" w:hAnsi="Arial"/>
+          <w:b/>
+          <w:bCs/>
+          <w:color w:val="1a365d"/>
+          <w:sz w:val="20"/>
+          <w:szCs w:val="20"/>
+        </w:rPr>
+        <w:t xml:space="preserve">In plain terms: </w:t>
+      </w:r>
+      <w:r>
+        <w:rPr>
+          <w:rFonts w:ascii="Arial" w:cs="Arial" w:eastAsia="Arial" w:hAnsi="Arial"/>
+          <w:color w:val="444444"/>
+          <w:sz w:val="20"/>
+          <w:szCs w:val="20"/>
+        </w:rPr>
+        <w:t xml:space="preserve">BetsPlug is similar to a weather station that forecasts the weather: it provides an estimate based on data, but cannot guarantee the weather. Similarly, BetsPlug estimates match outcomes but does not guarantee results.</w:t>
+      </w:r>
+    </w:p>
     <w:p>
       <w:pPr>
         <w:pStyle w:val="Heading1"/>
@@ -667,7 +658,7 @@
           <w:sz w:val="32"/>
           <w:szCs w:val="32"/>
         </w:rPr>
-        <w:t xml:space="preserve">3. Prediction Engine — Technical Specification</w:t>
+        <w:t xml:space="preserve">3. How Does the Prediction Work?</w:t>
       </w:r>
     </w:p>
     <w:p>
@@ -684,20 +675,159 @@
           <w:sz w:val="26"/>
           <w:szCs w:val="26"/>
         </w:rPr>
-        <w:t xml:space="preserve">3.1 Model Architecture</w:t>
-      </w:r>
-    </w:p>
-    <w:p>
-      <w:pPr>
-        <w:spacing w:after="120"/>
-      </w:pPr>
-      <w:r>
-        <w:rPr>
-          <w:rFonts w:ascii="Arial" w:cs="Arial" w:eastAsia="Arial" w:hAnsi="Arial"/>
-          <w:sz w:val="22"/>
-          <w:szCs w:val="22"/>
-        </w:rPr>
-        <w:t xml:space="preserve">The engine employs a weighted ensemble of two active statistical models:</w:t>
+        <w:t xml:space="preserve">3.1 The Models — How a Prediction is Made</w:t>
+      </w:r>
+    </w:p>
+    <w:p>
+      <w:pPr>
+        <w:spacing w:after="140" w:line="320"/>
+      </w:pPr>
+      <w:r>
+        <w:rPr>
+          <w:rFonts w:ascii="Arial" w:cs="Arial" w:eastAsia="Arial" w:hAnsi="Arial"/>
+          <w:sz w:val="22"/>
+          <w:szCs w:val="22"/>
+        </w:rPr>
+        <w:t xml:space="preserve">The system combines two mathematical models that each look at match data from a different angle. By merging these two perspectives, the prediction becomes more accurate than either model alone.</w:t>
+      </w:r>
+    </w:p>
+    <w:p>
+      <w:pPr>
+        <w:spacing w:after="140" w:line="320"/>
+      </w:pPr>
+      <w:r>
+        <w:rPr>
+          <w:rFonts w:ascii="Arial" w:cs="Arial" w:eastAsia="Arial" w:hAnsi="Arial"/>
+          <w:b/>
+          <w:bCs/>
+          <w:sz w:val="22"/>
+          <w:szCs w:val="22"/>
+        </w:rPr>
+        <w:t xml:space="preserve">Model 1: Elo Rating System</w:t>
+      </w:r>
+    </w:p>
+    <w:p>
+      <w:pPr>
+        <w:spacing w:after="140" w:line="320"/>
+      </w:pPr>
+      <w:r>
+        <w:rPr>
+          <w:rFonts w:ascii="Arial" w:cs="Arial" w:eastAsia="Arial" w:hAnsi="Arial"/>
+          <w:sz w:val="22"/>
+          <w:szCs w:val="22"/>
+        </w:rPr>
+        <w:t xml:space="preserve">Every team receives an “Elo score” — a number indicating how strong the team is. The more matches a team wins (especially against strong opponents), the higher the score. The system compares the Elo scores of both teams to determine who is the favourite. Think of it like a ranking system in tennis or chess.</w:t>
+      </w:r>
+    </w:p>
+    <w:p>
+      <w:pPr>
+        <w:spacing w:after="140" w:line="320"/>
+      </w:pPr>
+      <w:r>
+        <w:rPr>
+          <w:rFonts w:ascii="Arial" w:cs="Arial" w:eastAsia="Arial" w:hAnsi="Arial"/>
+          <w:b/>
+          <w:bCs/>
+          <w:sz w:val="22"/>
+          <w:szCs w:val="22"/>
+        </w:rPr>
+        <w:t xml:space="preserve">Model 2: Logistic Regression</w:t>
+      </w:r>
+    </w:p>
+    <w:p>
+      <w:pPr>
+        <w:spacing w:after="140" w:line="320"/>
+      </w:pPr>
+      <w:r>
+        <w:rPr>
+          <w:rFonts w:ascii="Arial" w:cs="Arial" w:eastAsia="Arial" w:hAnsi="Arial"/>
+          <w:sz w:val="22"/>
+          <w:szCs w:val="22"/>
+        </w:rPr>
+        <w:t xml:space="preserve">This model examines 43 different factors simultaneously, for example: how has the team performed in their last 5 matches? How often did they win at home? What is the head-to-head record? What is the difference in league standing? The model has learned from thousands of historical matches which combination of factors best predicts the outcome.</w:t>
+      </w:r>
+    </w:p>
+    <w:p>
+      <w:pPr>
+        <w:spacing w:after="140" w:line="320"/>
+      </w:pPr>
+      <w:r>
+        <w:rPr>
+          <w:rFonts w:ascii="Arial" w:cs="Arial" w:eastAsia="Arial" w:hAnsi="Arial"/>
+          <w:sz w:val="22"/>
+          <w:szCs w:val="22"/>
+        </w:rPr>
+        <w:t xml:space="preserve">The two models are combined with a weight: the Logistic model counts twice as much as the Elo model, because testing showed this produces the best results.</w:t>
+      </w:r>
+    </w:p>
+    <w:p>
+      <w:pPr>
+        <w:shd w:fill="f5f5f5" w:val="clear"/>
+        <w:spacing w:after="160" w:before="80" w:line="320"/>
+        <w:ind w:left="200" w:right="200"/>
+      </w:pPr>
+      <w:r>
+        <w:rPr>
+          <w:rFonts w:ascii="Arial" w:cs="Arial" w:eastAsia="Arial" w:hAnsi="Arial"/>
+          <w:b/>
+          <w:bCs/>
+          <w:color w:val="1a365d"/>
+          <w:sz w:val="20"/>
+          <w:szCs w:val="20"/>
+        </w:rPr>
+        <w:t xml:space="preserve">In plain terms: </w:t>
+      </w:r>
+      <w:r>
+        <w:rPr>
+          <w:rFonts w:ascii="Arial" w:cs="Arial" w:eastAsia="Arial" w:hAnsi="Arial"/>
+          <w:color w:val="444444"/>
+          <w:sz w:val="20"/>
+          <w:szCs w:val="20"/>
+        </w:rPr>
+        <w:t xml:space="preserve">Imagine asking two experts who will win a match. Expert 1 (Elo) only looks at the overall strength of teams. Expert 2 (Logistic) looks at 43 details. You listen to both, but give Expert 2 more weight because they are right more often. That is what BetsPlug does.</w:t>
+      </w:r>
+    </w:p>
+    <w:p>
+      <w:pPr>
+        <w:pStyle w:val="Heading2"/>
+        <w:spacing w:after="160" w:before="280"/>
+      </w:pPr>
+      <w:r>
+        <w:rPr>
+          <w:rFonts w:ascii="Arial" w:cs="Arial" w:eastAsia="Arial" w:hAnsi="Arial"/>
+          <w:b/>
+          <w:bCs/>
+          <w:color w:val="1a365d"/>
+          <w:sz w:val="26"/>
+          <w:szCs w:val="26"/>
+        </w:rPr>
+        <w:t xml:space="preserve">3.2 Safeguards Against Data Cheating</w:t>
+      </w:r>
+    </w:p>
+    <w:p>
+      <w:pPr>
+        <w:spacing w:after="140" w:line="320"/>
+      </w:pPr>
+      <w:r>
+        <w:rPr>
+          <w:rFonts w:ascii="Arial" w:cs="Arial" w:eastAsia="Arial" w:hAnsi="Arial"/>
+          <w:sz w:val="22"/>
+          <w:szCs w:val="22"/>
+        </w:rPr>
+        <w:t xml:space="preserve">A major risk with prediction systems is that they accidentally use information that was not available at the time of the prediction. For example: if the system knew the result of a match while trying to predict it, it would be cheating.</w:t>
+      </w:r>
+    </w:p>
+    <w:p>
+      <w:pPr>
+        <w:spacing w:after="140" w:line="320"/>
+      </w:pPr>
+      <w:r>
+        <w:rPr>
+          <w:rFonts w:ascii="Arial" w:cs="Arial" w:eastAsia="Arial" w:hAnsi="Arial"/>
+          <w:sz w:val="22"/>
+          <w:szCs w:val="22"/>
+        </w:rPr>
+        <w:t xml:space="preserve">BetsPlug has built in multiple safeguards to prevent this:</w:t>
       </w:r>
     </w:p>
     <w:p>
@@ -707,15 +837,15 @@
           <w:ilvl w:val="0"/>
           <w:numId w:val="2"/>
         </w:numPr>
-        <w:spacing w:after="60"/>
-      </w:pPr>
-      <w:r>
-        <w:rPr>
-          <w:rFonts w:ascii="Arial" w:cs="Arial" w:eastAsia="Arial" w:hAnsi="Arial"/>
-          <w:sz w:val="22"/>
-          <w:szCs w:val="22"/>
-        </w:rPr>
-        <w:t xml:space="preserve">Elo Rating System (weight: 1.2) — Adaptive team strength ratings with 65-point home advantage calibration, point-in-time enforcement, and K-factor of 20.</w:t>
+        <w:spacing w:after="80" w:line="320"/>
+      </w:pPr>
+      <w:r>
+        <w:rPr>
+          <w:rFonts w:ascii="Arial" w:cs="Arial" w:eastAsia="Arial" w:hAnsi="Arial"/>
+          <w:sz w:val="22"/>
+          <w:szCs w:val="22"/>
+        </w:rPr>
+        <w:t xml:space="preserve">Team strengths (Elo scores) are only retrieved up to the moment BEFORE kickoff — never after</w:t>
       </w:r>
     </w:p>
     <w:p>
@@ -725,28 +855,78 @@
           <w:ilvl w:val="0"/>
           <w:numId w:val="2"/>
         </w:numPr>
-        <w:spacing w:after="60"/>
-      </w:pPr>
-      <w:r>
-        <w:rPr>
-          <w:rFonts w:ascii="Arial" w:cs="Arial" w:eastAsia="Arial" w:hAnsi="Arial"/>
-          <w:sz w:val="22"/>
-          <w:szCs w:val="22"/>
-        </w:rPr>
-        <w:t xml:space="preserve">Logistic Regression (weight: 2.0) — 43-feature classifier trained on historical match data including team form, head-to-head records, league standings, and Elo differentials.</w:t>
-      </w:r>
-    </w:p>
-    <w:p>
-      <w:pPr>
-        <w:spacing w:after="120"/>
-      </w:pPr>
-      <w:r>
-        <w:rPr>
-          <w:rFonts w:ascii="Arial" w:cs="Arial" w:eastAsia="Arial" w:hAnsi="Arial"/>
-          <w:sz w:val="22"/>
-          <w:szCs w:val="22"/>
-        </w:rPr>
-        <w:t xml:space="preserve">Two additional models (Poisson and XGBoost) were evaluated but disabled after grid search optimization demonstrated they introduce noise without improving accuracy.</w:t>
+        <w:spacing w:after="80" w:line="320"/>
+      </w:pPr>
+      <w:r>
+        <w:rPr>
+          <w:rFonts w:ascii="Arial" w:cs="Arial" w:eastAsia="Arial" w:hAnsi="Arial"/>
+          <w:sz w:val="22"/>
+          <w:szCs w:val="22"/>
+        </w:rPr>
+        <w:t xml:space="preserve">Team form (last 5 matches) only includes matches already played before the match being predicted</w:t>
+      </w:r>
+    </w:p>
+    <w:p>
+      <w:pPr>
+        <w:pStyle w:val="ListParagraph"/>
+        <w:numPr>
+          <w:ilvl w:val="0"/>
+          <w:numId w:val="2"/>
+        </w:numPr>
+        <w:spacing w:after="80" w:line="320"/>
+      </w:pPr>
+      <w:r>
+        <w:rPr>
+          <w:rFonts w:ascii="Arial" w:cs="Arial" w:eastAsia="Arial" w:hAnsi="Arial"/>
+          <w:sz w:val="22"/>
+          <w:szCs w:val="22"/>
+        </w:rPr>
+        <w:t xml:space="preserve">Head-to-head records only include previous encounters, never the match itself</w:t>
+      </w:r>
+    </w:p>
+    <w:p>
+      <w:pPr>
+        <w:pStyle w:val="ListParagraph"/>
+        <w:numPr>
+          <w:ilvl w:val="0"/>
+          <w:numId w:val="2"/>
+        </w:numPr>
+        <w:spacing w:after="80" w:line="320"/>
+      </w:pPr>
+      <w:r>
+        <w:rPr>
+          <w:rFonts w:ascii="Arial" w:cs="Arial" w:eastAsia="Arial" w:hAnsi="Arial"/>
+          <w:sz w:val="22"/>
+          <w:szCs w:val="22"/>
+        </w:rPr>
+        <w:t xml:space="preserve">If the system detects that future data is accidentally being used, it automatically stops with an error</w:t>
+      </w:r>
+    </w:p>
+    <w:p>
+      <w:pPr>
+        <w:shd w:fill="f5f5f5" w:val="clear"/>
+        <w:spacing w:after="160" w:before="80" w:line="320"/>
+        <w:ind w:left="200" w:right="200"/>
+      </w:pPr>
+      <w:r>
+        <w:rPr>
+          <w:rFonts w:ascii="Arial" w:cs="Arial" w:eastAsia="Arial" w:hAnsi="Arial"/>
+          <w:b/>
+          <w:bCs/>
+          <w:color w:val="1a365d"/>
+          <w:sz w:val="20"/>
+          <w:szCs w:val="20"/>
+        </w:rPr>
+        <w:t xml:space="preserve">In plain terms: </w:t>
+      </w:r>
+      <w:r>
+        <w:rPr>
+          <w:rFonts w:ascii="Arial" w:cs="Arial" w:eastAsia="Arial" w:hAnsi="Arial"/>
+          <w:color w:val="444444"/>
+          <w:sz w:val="20"/>
+          <w:szCs w:val="20"/>
+        </w:rPr>
+        <w:t xml:space="preserve">This is like a school exam: if a student already knows the answers, the test is not fair. BetsPlug ensures the system can never see the “answers” (the match result) before making its prediction.</w:t>
       </w:r>
     </w:p>
     <w:p>
@@ -763,140 +943,20 @@
           <w:sz w:val="26"/>
           <w:szCs w:val="26"/>
         </w:rPr>
-        <w:t xml:space="preserve">3.2 Anti-Leakage Safeguards</w:t>
-      </w:r>
-    </w:p>
-    <w:p>
-      <w:pPr>
-        <w:spacing w:after="120"/>
-      </w:pPr>
-      <w:r>
-        <w:rPr>
-          <w:rFonts w:ascii="Arial" w:cs="Arial" w:eastAsia="Arial" w:hAnsi="Arial"/>
-          <w:sz w:val="22"/>
-          <w:szCs w:val="22"/>
-        </w:rPr>
-        <w:t xml:space="preserve">Data integrity is enforced through multiple safeguards to prevent future information from contaminating predictions:</w:t>
-      </w:r>
-    </w:p>
-    <w:p>
-      <w:pPr>
-        <w:pStyle w:val="ListParagraph"/>
-        <w:numPr>
-          <w:ilvl w:val="0"/>
-          <w:numId w:val="2"/>
-        </w:numPr>
-        <w:spacing w:after="60"/>
-      </w:pPr>
-      <w:r>
-        <w:rPr>
-          <w:rFonts w:ascii="Arial" w:cs="Arial" w:eastAsia="Arial" w:hAnsi="Arial"/>
-          <w:sz w:val="22"/>
-          <w:szCs w:val="22"/>
-        </w:rPr>
-        <w:t xml:space="preserve">Elo ratings: queried with strict effective_at &lt; kickoff temporal filter</w:t>
-      </w:r>
-    </w:p>
-    <w:p>
-      <w:pPr>
-        <w:pStyle w:val="ListParagraph"/>
-        <w:numPr>
-          <w:ilvl w:val="0"/>
-          <w:numId w:val="2"/>
-        </w:numPr>
-        <w:spacing w:after="60"/>
-      </w:pPr>
-      <w:r>
-        <w:rPr>
-          <w:rFonts w:ascii="Arial" w:cs="Arial" w:eastAsia="Arial" w:hAnsi="Arial"/>
-          <w:sz w:val="22"/>
-          <w:szCs w:val="22"/>
-        </w:rPr>
-        <w:t xml:space="preserve">FeatureLeakageError: runtime exception raised if any data integrity violation is detected</w:t>
-      </w:r>
-    </w:p>
-    <w:p>
-      <w:pPr>
-        <w:pStyle w:val="ListParagraph"/>
-        <w:numPr>
-          <w:ilvl w:val="0"/>
-          <w:numId w:val="2"/>
-        </w:numPr>
-        <w:spacing w:after="60"/>
-      </w:pPr>
-      <w:r>
-        <w:rPr>
-          <w:rFonts w:ascii="Arial" w:cs="Arial" w:eastAsia="Arial" w:hAnsi="Arial"/>
-          <w:sz w:val="22"/>
-          <w:szCs w:val="22"/>
-        </w:rPr>
-        <w:t xml:space="preserve">Team form: filtered with before=scheduled_at to ensure only pre-match data</w:t>
-      </w:r>
-    </w:p>
-    <w:p>
-      <w:pPr>
-        <w:pStyle w:val="ListParagraph"/>
-        <w:numPr>
-          <w:ilvl w:val="0"/>
-          <w:numId w:val="2"/>
-        </w:numPr>
-        <w:spacing w:after="60"/>
-      </w:pPr>
-      <w:r>
-        <w:rPr>
-          <w:rFonts w:ascii="Arial" w:cs="Arial" w:eastAsia="Arial" w:hAnsi="Arial"/>
-          <w:sz w:val="22"/>
-          <w:szCs w:val="22"/>
-        </w:rPr>
-        <w:t xml:space="preserve">Head-to-head: restricted to historical encounters only</w:t>
-      </w:r>
-    </w:p>
-    <w:p>
-      <w:pPr>
-        <w:pStyle w:val="ListParagraph"/>
-        <w:numPr>
-          <w:ilvl w:val="0"/>
-          <w:numId w:val="2"/>
-        </w:numPr>
-        <w:spacing w:after="60"/>
-      </w:pPr>
-      <w:r>
-        <w:rPr>
-          <w:rFonts w:ascii="Arial" w:cs="Arial" w:eastAsia="Arial" w:hAnsi="Arial"/>
-          <w:sz w:val="22"/>
-          <w:szCs w:val="22"/>
-        </w:rPr>
-        <w:t xml:space="preserve">All 43 features verified as point-in-time safe through code-level enforcement</w:t>
-      </w:r>
-    </w:p>
-    <w:p>
-      <w:pPr>
-        <w:pStyle w:val="Heading2"/>
-        <w:spacing w:after="160" w:before="280"/>
-      </w:pPr>
-      <w:r>
-        <w:rPr>
-          <w:rFonts w:ascii="Arial" w:cs="Arial" w:eastAsia="Arial" w:hAnsi="Arial"/>
-          <w:b/>
-          <w:bCs/>
-          <w:color w:val="1a365d"/>
-          <w:sz w:val="26"/>
-          <w:szCs w:val="26"/>
-        </w:rPr>
-        <w:t xml:space="preserve">3.3 Prediction Source Classification</w:t>
-      </w:r>
-    </w:p>
-    <w:p>
-      <w:pPr>
-        <w:spacing w:after="120"/>
-      </w:pPr>
-      <w:r>
-        <w:rPr>
-          <w:rFonts w:ascii="Arial" w:cs="Arial" w:eastAsia="Arial" w:hAnsi="Arial"/>
-          <w:sz w:val="22"/>
-          <w:szCs w:val="22"/>
-        </w:rPr>
-        <w:t xml:space="preserve">Every prediction is immutably classified at creation time:</w:t>
+        <w:t xml:space="preserve">3.3 Live vs. Backtest — Two Types of Predictions</w:t>
+      </w:r>
+    </w:p>
+    <w:p>
+      <w:pPr>
+        <w:spacing w:after="140" w:line="320"/>
+      </w:pPr>
+      <w:r>
+        <w:rPr>
+          <w:rFonts w:ascii="Arial" w:cs="Arial" w:eastAsia="Arial" w:hAnsi="Arial"/>
+          <w:sz w:val="22"/>
+          <w:szCs w:val="22"/>
+        </w:rPr>
+        <w:t xml:space="preserve">BetsPlug distinguishes between two types of predictions:</w:t>
       </w:r>
     </w:p>
     <w:tbl>
@@ -942,7 +1002,7 @@
                 <w:sz w:val="20"/>
                 <w:szCs w:val="20"/>
               </w:rPr>
-              <w:t xml:space="preserve">Field</w:t>
+              <w:t xml:space="preserve">Type</w:t>
             </w:r>
           </w:p>
         </w:tc>
@@ -972,7 +1032,7 @@
                 <w:sz w:val="20"/>
                 <w:szCs w:val="20"/>
               </w:rPr>
-              <w:t xml:space="preserve">Description</w:t>
+              <w:t xml:space="preserve">Explanation</w:t>
             </w:r>
           </w:p>
         </w:tc>
@@ -1004,7 +1064,7 @@
                 <w:sz w:val="20"/>
                 <w:szCs w:val="20"/>
               </w:rPr>
-              <w:t xml:space="preserve">prediction_source</w:t>
+              <w:t xml:space="preserve">Live prediction</w:t>
             </w:r>
           </w:p>
         </w:tc>
@@ -1034,7 +1094,7 @@
                 <w:sz w:val="20"/>
                 <w:szCs w:val="20"/>
               </w:rPr>
-              <w:t xml:space="preserve">'live' (pre-match) or 'backtest' (retroactive simulation)</w:t>
+              <w:t xml:space="preserve">Made BEFORE the match starts. Locked with a timestamp as proof. This is the “real” prediction.</w:t>
             </w:r>
           </w:p>
         </w:tc>
@@ -1066,7 +1126,7 @@
                 <w:sz w:val="20"/>
                 <w:szCs w:val="20"/>
               </w:rPr>
-              <w:t xml:space="preserve">locked_at</w:t>
+              <w:t xml:space="preserve">Backtest prediction</w:t>
             </w:r>
           </w:p>
         </w:tc>
@@ -1096,198 +1156,52 @@
                 <w:sz w:val="20"/>
                 <w:szCs w:val="20"/>
               </w:rPr>
-              <w:t xml:space="preserve">Timestamp proof when live prediction was frozen</w:t>
-            </w:r>
-          </w:p>
-        </w:tc>
-      </w:tr>
-      <w:tr>
-        <w:tc>
-          <w:tcPr>
-            <w:tcW w:type="dxa" w:w="4500"/>
-            <w:tcBorders>
-              <w:top w:val="single" w:color="cccccc" w:sz="1"/>
-              <w:left w:val="single" w:color="cccccc" w:sz="1"/>
-              <w:bottom w:val="single" w:color="cccccc" w:sz="1"/>
-              <w:right w:val="single" w:color="cccccc" w:sz="1"/>
-            </w:tcBorders>
-            <w:shd w:fill="ffffff" w:val="clear"/>
-            <w:tcMar>
-              <w:top w:type="dxa" w:w="80"/>
-              <w:left w:type="dxa" w:w="120"/>
-              <w:bottom w:type="dxa" w:w="80"/>
-              <w:right w:type="dxa" w:w="120"/>
-            </w:tcMar>
-          </w:tcPr>
-          <w:p>
-            <w:r>
-              <w:rPr>
-                <w:rFonts w:ascii="Arial" w:cs="Arial" w:eastAsia="Arial" w:hAnsi="Arial"/>
-                <w:b w:val="false"/>
-                <w:bCs w:val="false"/>
-                <w:sz w:val="20"/>
-                <w:szCs w:val="20"/>
-              </w:rPr>
-              <w:t xml:space="preserve">match_scheduled_at</w:t>
-            </w:r>
-          </w:p>
-        </w:tc>
-        <w:tc>
-          <w:tcPr>
-            <w:tcW w:type="dxa" w:w="4526"/>
-            <w:tcBorders>
-              <w:top w:val="single" w:color="cccccc" w:sz="1"/>
-              <w:left w:val="single" w:color="cccccc" w:sz="1"/>
-              <w:bottom w:val="single" w:color="cccccc" w:sz="1"/>
-              <w:right w:val="single" w:color="cccccc" w:sz="1"/>
-            </w:tcBorders>
-            <w:shd w:fill="ffffff" w:val="clear"/>
-            <w:tcMar>
-              <w:top w:type="dxa" w:w="80"/>
-              <w:left w:type="dxa" w:w="120"/>
-              <w:bottom w:type="dxa" w:w="80"/>
-              <w:right w:type="dxa" w:w="120"/>
-            </w:tcMar>
-          </w:tcPr>
-          <w:p>
-            <w:r>
-              <w:rPr>
-                <w:rFonts w:ascii="Arial" w:cs="Arial" w:eastAsia="Arial" w:hAnsi="Arial"/>
-                <w:b w:val="false"/>
-                <w:bCs w:val="false"/>
-                <w:sz w:val="20"/>
-                <w:szCs w:val="20"/>
-              </w:rPr>
-              <w:t xml:space="preserve">Immutable snapshot of kickoff time at prediction moment</w:t>
-            </w:r>
-          </w:p>
-        </w:tc>
-      </w:tr>
-      <w:tr>
-        <w:tc>
-          <w:tcPr>
-            <w:tcW w:type="dxa" w:w="4500"/>
-            <w:tcBorders>
-              <w:top w:val="single" w:color="cccccc" w:sz="1"/>
-              <w:left w:val="single" w:color="cccccc" w:sz="1"/>
-              <w:bottom w:val="single" w:color="cccccc" w:sz="1"/>
-              <w:right w:val="single" w:color="cccccc" w:sz="1"/>
-            </w:tcBorders>
-            <w:shd w:fill="ffffff" w:val="clear"/>
-            <w:tcMar>
-              <w:top w:type="dxa" w:w="80"/>
-              <w:left w:type="dxa" w:w="120"/>
-              <w:bottom w:type="dxa" w:w="80"/>
-              <w:right w:type="dxa" w:w="120"/>
-            </w:tcMar>
-          </w:tcPr>
-          <w:p>
-            <w:r>
-              <w:rPr>
-                <w:rFonts w:ascii="Arial" w:cs="Arial" w:eastAsia="Arial" w:hAnsi="Arial"/>
-                <w:b w:val="false"/>
-                <w:bCs w:val="false"/>
-                <w:sz w:val="20"/>
-                <w:szCs w:val="20"/>
-              </w:rPr>
-              <w:t xml:space="preserve">lead_time_hours</w:t>
-            </w:r>
-          </w:p>
-        </w:tc>
-        <w:tc>
-          <w:tcPr>
-            <w:tcW w:type="dxa" w:w="4526"/>
-            <w:tcBorders>
-              <w:top w:val="single" w:color="cccccc" w:sz="1"/>
-              <w:left w:val="single" w:color="cccccc" w:sz="1"/>
-              <w:bottom w:val="single" w:color="cccccc" w:sz="1"/>
-              <w:right w:val="single" w:color="cccccc" w:sz="1"/>
-            </w:tcBorders>
-            <w:shd w:fill="ffffff" w:val="clear"/>
-            <w:tcMar>
-              <w:top w:type="dxa" w:w="80"/>
-              <w:left w:type="dxa" w:w="120"/>
-              <w:bottom w:type="dxa" w:w="80"/>
-              <w:right w:type="dxa" w:w="120"/>
-            </w:tcMar>
-          </w:tcPr>
-          <w:p>
-            <w:r>
-              <w:rPr>
-                <w:rFonts w:ascii="Arial" w:cs="Arial" w:eastAsia="Arial" w:hAnsi="Arial"/>
-                <w:b w:val="false"/>
-                <w:bCs w:val="false"/>
-                <w:sz w:val="20"/>
-                <w:szCs w:val="20"/>
-              </w:rPr>
-              <w:t xml:space="preserve">Hours before kickoff the prediction was generated</w:t>
-            </w:r>
-          </w:p>
-        </w:tc>
-      </w:tr>
-      <w:tr>
-        <w:tc>
-          <w:tcPr>
-            <w:tcW w:type="dxa" w:w="4500"/>
-            <w:tcBorders>
-              <w:top w:val="single" w:color="cccccc" w:sz="1"/>
-              <w:left w:val="single" w:color="cccccc" w:sz="1"/>
-              <w:bottom w:val="single" w:color="cccccc" w:sz="1"/>
-              <w:right w:val="single" w:color="cccccc" w:sz="1"/>
-            </w:tcBorders>
-            <w:shd w:fill="ffffff" w:val="clear"/>
-            <w:tcMar>
-              <w:top w:type="dxa" w:w="80"/>
-              <w:left w:type="dxa" w:w="120"/>
-              <w:bottom w:type="dxa" w:w="80"/>
-              <w:right w:type="dxa" w:w="120"/>
-            </w:tcMar>
-          </w:tcPr>
-          <w:p>
-            <w:r>
-              <w:rPr>
-                <w:rFonts w:ascii="Arial" w:cs="Arial" w:eastAsia="Arial" w:hAnsi="Arial"/>
-                <w:b w:val="false"/>
-                <w:bCs w:val="false"/>
-                <w:sz w:val="20"/>
-                <w:szCs w:val="20"/>
-              </w:rPr>
-              <w:t xml:space="preserve">closing_odds_snapshot</w:t>
-            </w:r>
-          </w:p>
-        </w:tc>
-        <w:tc>
-          <w:tcPr>
-            <w:tcW w:type="dxa" w:w="4526"/>
-            <w:tcBorders>
-              <w:top w:val="single" w:color="cccccc" w:sz="1"/>
-              <w:left w:val="single" w:color="cccccc" w:sz="1"/>
-              <w:bottom w:val="single" w:color="cccccc" w:sz="1"/>
-              <w:right w:val="single" w:color="cccccc" w:sz="1"/>
-            </w:tcBorders>
-            <w:shd w:fill="ffffff" w:val="clear"/>
-            <w:tcMar>
-              <w:top w:type="dxa" w:w="80"/>
-              <w:left w:type="dxa" w:w="120"/>
-              <w:bottom w:type="dxa" w:w="80"/>
-              <w:right w:type="dxa" w:w="120"/>
-            </w:tcMar>
-          </w:tcPr>
-          <w:p>
-            <w:r>
-              <w:rPr>
-                <w:rFonts w:ascii="Arial" w:cs="Arial" w:eastAsia="Arial" w:hAnsi="Arial"/>
-                <w:b w:val="false"/>
-                <w:bCs w:val="false"/>
-                <w:sz w:val="20"/>
-                <w:szCs w:val="20"/>
-              </w:rPr>
-              <w:t xml:space="preserve">Bookmaker odds and value analysis at prediction time</w:t>
+              <w:t xml:space="preserve">Made after the fact on historical data to test the system. Clearly labelled as “simulation”.</w:t>
             </w:r>
           </w:p>
         </w:tc>
       </w:tr>
     </w:tbl>
+    <w:p>
+      <w:pPr>
+        <w:spacing w:after="140" w:line="320"/>
+      </w:pPr>
+      <w:r>
+        <w:rPr>
+          <w:rFonts w:ascii="Arial" w:cs="Arial" w:eastAsia="Arial" w:hAnsi="Arial"/>
+          <w:sz w:val="22"/>
+          <w:szCs w:val="22"/>
+        </w:rPr>
+        <w:t xml:space="preserve">This distinction is crucial for honesty. Many prediction platforms do not show this difference, making it appear they perform better than they actually do. BetsPlug always reports separately how well live predictions and backtests perform.</w:t>
+      </w:r>
+    </w:p>
+    <w:p>
+      <w:pPr>
+        <w:shd w:fill="f5f5f5" w:val="clear"/>
+        <w:spacing w:after="160" w:before="80" w:line="320"/>
+        <w:ind w:left="200" w:right="200"/>
+      </w:pPr>
+      <w:r>
+        <w:rPr>
+          <w:rFonts w:ascii="Arial" w:cs="Arial" w:eastAsia="Arial" w:hAnsi="Arial"/>
+          <w:b/>
+          <w:bCs/>
+          <w:color w:val="1a365d"/>
+          <w:sz w:val="20"/>
+          <w:szCs w:val="20"/>
+        </w:rPr>
+        <w:t xml:space="preserve">In plain terms: </w:t>
+      </w:r>
+      <w:r>
+        <w:rPr>
+          <w:rFonts w:ascii="Arial" w:cs="Arial" w:eastAsia="Arial" w:hAnsi="Arial"/>
+          <w:color w:val="444444"/>
+          <w:sz w:val="20"/>
+          <w:szCs w:val="20"/>
+        </w:rPr>
+        <w:t xml:space="preserve">Compare it to a doctor who says after the fact “I knew it all along” versus a doctor who makes a diagnosis beforehand. Only the diagnosis made in advance truly counts. BetsPlug always shows which predictions were genuinely made in advance.</w:t>
+      </w:r>
+    </w:p>
     <w:p>
       <w:pPr>
         <w:pStyle w:val="Heading2"/>
@@ -1302,20 +1216,20 @@
           <w:sz w:val="26"/>
           <w:szCs w:val="26"/>
         </w:rPr>
-        <w:t xml:space="preserve">3.4 Validated Performance Metrics</w:t>
-      </w:r>
-    </w:p>
-    <w:p>
-      <w:pPr>
-        <w:spacing w:after="120"/>
-      </w:pPr>
-      <w:r>
-        <w:rPr>
-          <w:rFonts w:ascii="Arial" w:cs="Arial" w:eastAsia="Arial" w:hAnsi="Arial"/>
-          <w:sz w:val="22"/>
-          <w:szCs w:val="22"/>
-        </w:rPr>
-        <w:t xml:space="preserve">Optimization was performed via exhaustive grid search across 1,295 weight configurations on 6,502 evaluated predictions:</w:t>
+        <w:t xml:space="preserve">3.4 How Well Does the System Perform?</w:t>
+      </w:r>
+    </w:p>
+    <w:p>
+      <w:pPr>
+        <w:spacing w:after="140" w:line="320"/>
+      </w:pPr>
+      <w:r>
+        <w:rPr>
+          <w:rFonts w:ascii="Arial" w:cs="Arial" w:eastAsia="Arial" w:hAnsi="Arial"/>
+          <w:sz w:val="22"/>
+          <w:szCs w:val="22"/>
+        </w:rPr>
+        <w:t xml:space="preserve">The system has been extensively tested to measure its reliability. Here are the results:</w:t>
       </w:r>
     </w:p>
     <w:tbl>
@@ -1391,7 +1305,7 @@
                 <w:sz w:val="20"/>
                 <w:szCs w:val="20"/>
               </w:rPr>
-              <w:t xml:space="preserve">Value</w:t>
+              <w:t xml:space="preserve">Result</w:t>
             </w:r>
           </w:p>
         </w:tc>
@@ -1453,7 +1367,7 @@
                 <w:sz w:val="20"/>
                 <w:szCs w:val="20"/>
               </w:rPr>
-              <w:t xml:space="preserve">1,295</w:t>
+              <w:t xml:space="preserve">1,295 different settings compared</w:t>
             </w:r>
           </w:p>
         </w:tc>
@@ -1485,7 +1399,7 @@
                 <w:sz w:val="20"/>
                 <w:szCs w:val="20"/>
               </w:rPr>
-              <w:t xml:space="preserve">Total predictions evaluated</w:t>
+              <w:t xml:space="preserve">Total matches evaluated</w:t>
             </w:r>
           </w:p>
         </w:tc>
@@ -1515,7 +1429,7 @@
                 <w:sz w:val="20"/>
                 <w:szCs w:val="20"/>
               </w:rPr>
-              <w:t xml:space="preserve">6,502</w:t>
+              <w:t xml:space="preserve">6,502 matches</w:t>
             </w:r>
           </w:p>
         </w:tc>
@@ -1547,7 +1461,7 @@
                 <w:sz w:val="20"/>
                 <w:szCs w:val="20"/>
               </w:rPr>
-              <w:t xml:space="preserve">Backtest accuracy (Aug 2024 – Dec 2025)</w:t>
+              <w:t xml:space="preserve">Accuracy on training data (2024–2025)</w:t>
             </w:r>
           </w:p>
         </w:tc>
@@ -1577,7 +1491,7 @@
                 <w:sz w:val="20"/>
                 <w:szCs w:val="20"/>
               </w:rPr>
-              <w:t xml:space="preserve">50.4% (3,743 predictions)</w:t>
+              <w:t xml:space="preserve">50.4% correct (3,743 matches)</w:t>
             </w:r>
           </w:p>
         </w:tc>
@@ -1609,7 +1523,7 @@
                 <w:sz w:val="20"/>
                 <w:szCs w:val="20"/>
               </w:rPr>
-              <w:t xml:space="preserve">Validation accuracy (Jan 2026 – Apr 2026)</w:t>
+              <w:t xml:space="preserve">Accuracy on new data (2026)</w:t>
             </w:r>
           </w:p>
         </w:tc>
@@ -1639,7 +1553,7 @@
                 <w:sz w:val="20"/>
                 <w:szCs w:val="20"/>
               </w:rPr>
-              <w:t xml:space="preserve">48.9% (2,759 predictions)</w:t>
+              <w:t xml:space="preserve">48.9% correct (2,759 matches)</w:t>
             </w:r>
           </w:p>
         </w:tc>
@@ -1671,7 +1585,7 @@
                 <w:sz w:val="20"/>
                 <w:szCs w:val="20"/>
               </w:rPr>
-              <w:t xml:space="preserve">BOTD backtest accuracy</w:t>
+              <w:t xml:space="preserve">Pick of the Day on training data</w:t>
             </w:r>
           </w:p>
         </w:tc>
@@ -1701,7 +1615,7 @@
                 <w:sz w:val="20"/>
                 <w:szCs w:val="20"/>
               </w:rPr>
-              <w:t xml:space="preserve">70.1% (432 picks)</w:t>
+              <w:t xml:space="preserve">70.1% correct (432 picks)</w:t>
             </w:r>
           </w:p>
         </w:tc>
@@ -1733,7 +1647,7 @@
                 <w:sz w:val="20"/>
                 <w:szCs w:val="20"/>
               </w:rPr>
-              <w:t xml:space="preserve">BOTD validation accuracy</w:t>
+              <w:t xml:space="preserve">Pick of the Day on new data</w:t>
             </w:r>
           </w:p>
         </w:tc>
@@ -1763,7 +1677,7 @@
                 <w:sz w:val="20"/>
                 <w:szCs w:val="20"/>
               </w:rPr>
-              <w:t xml:space="preserve">71.1% (232 picks)</w:t>
+              <w:t xml:space="preserve">71.1% correct (232 picks)</w:t>
             </w:r>
           </w:p>
         </w:tc>
@@ -1795,7 +1709,7 @@
                 <w:sz w:val="20"/>
                 <w:szCs w:val="20"/>
               </w:rPr>
-              <w:t xml:space="preserve">Random baseline (3-way)</w:t>
+              <w:t xml:space="preserve">Random guessing (home/draw/away)</w:t>
             </w:r>
           </w:p>
         </w:tc>
@@ -1825,74 +1739,52 @@
                 <w:sz w:val="20"/>
                 <w:szCs w:val="20"/>
               </w:rPr>
-              <w:t xml:space="preserve">33.3%</w:t>
-            </w:r>
-          </w:p>
-        </w:tc>
-      </w:tr>
-      <w:tr>
-        <w:tc>
-          <w:tcPr>
-            <w:tcW w:type="dxa" w:w="4500"/>
-            <w:tcBorders>
-              <w:top w:val="single" w:color="cccccc" w:sz="1"/>
-              <w:left w:val="single" w:color="cccccc" w:sz="1"/>
-              <w:bottom w:val="single" w:color="cccccc" w:sz="1"/>
-              <w:right w:val="single" w:color="cccccc" w:sz="1"/>
-            </w:tcBorders>
-            <w:shd w:fill="ffffff" w:val="clear"/>
-            <w:tcMar>
-              <w:top w:type="dxa" w:w="80"/>
-              <w:left w:type="dxa" w:w="120"/>
-              <w:bottom w:type="dxa" w:w="80"/>
-              <w:right w:type="dxa" w:w="120"/>
-            </w:tcMar>
-          </w:tcPr>
-          <w:p>
-            <w:r>
-              <w:rPr>
-                <w:rFonts w:ascii="Arial" w:cs="Arial" w:eastAsia="Arial" w:hAnsi="Arial"/>
-                <w:b w:val="false"/>
-                <w:bCs w:val="false"/>
-                <w:sz w:val="20"/>
-                <w:szCs w:val="20"/>
-              </w:rPr>
-              <w:t xml:space="preserve">Backtest-validation gap</w:t>
-            </w:r>
-          </w:p>
-        </w:tc>
-        <w:tc>
-          <w:tcPr>
-            <w:tcW w:type="dxa" w:w="4526"/>
-            <w:tcBorders>
-              <w:top w:val="single" w:color="cccccc" w:sz="1"/>
-              <w:left w:val="single" w:color="cccccc" w:sz="1"/>
-              <w:bottom w:val="single" w:color="cccccc" w:sz="1"/>
-              <w:right w:val="single" w:color="cccccc" w:sz="1"/>
-            </w:tcBorders>
-            <w:shd w:fill="ffffff" w:val="clear"/>
-            <w:tcMar>
-              <w:top w:type="dxa" w:w="80"/>
-              <w:left w:type="dxa" w:w="120"/>
-              <w:bottom w:type="dxa" w:w="80"/>
-              <w:right w:type="dxa" w:w="120"/>
-            </w:tcMar>
-          </w:tcPr>
-          <w:p>
-            <w:r>
-              <w:rPr>
-                <w:rFonts w:ascii="Arial" w:cs="Arial" w:eastAsia="Arial" w:hAnsi="Arial"/>
-                <w:b w:val="false"/>
-                <w:bCs w:val="false"/>
-                <w:sz w:val="20"/>
-                <w:szCs w:val="20"/>
-              </w:rPr>
-              <w:t xml:space="preserve">1.5 percentage points (no overfitting)</w:t>
+              <w:t xml:space="preserve">33.3% correct</w:t>
             </w:r>
           </w:p>
         </w:tc>
       </w:tr>
     </w:tbl>
+    <w:p>
+      <w:pPr>
+        <w:spacing w:after="140" w:line="320"/>
+      </w:pPr>
+      <w:r>
+        <w:rPr>
+          <w:rFonts w:ascii="Arial" w:cs="Arial" w:eastAsia="Arial" w:hAnsi="Arial"/>
+          <w:sz w:val="22"/>
+          <w:szCs w:val="22"/>
+        </w:rPr>
+        <w:t xml:space="preserve">The difference between training and test results is small (1.5 percentage points), demonstrating the system is not “overfitted” — it works reliably even on data it has never seen before.</w:t>
+      </w:r>
+    </w:p>
+    <w:p>
+      <w:pPr>
+        <w:shd w:fill="f5f5f5" w:val="clear"/>
+        <w:spacing w:after="160" w:before="80" w:line="320"/>
+        <w:ind w:left="200" w:right="200"/>
+      </w:pPr>
+      <w:r>
+        <w:rPr>
+          <w:rFonts w:ascii="Arial" w:cs="Arial" w:eastAsia="Arial" w:hAnsi="Arial"/>
+          <w:b/>
+          <w:bCs/>
+          <w:color w:val="1a365d"/>
+          <w:sz w:val="20"/>
+          <w:szCs w:val="20"/>
+        </w:rPr>
+        <w:t xml:space="preserve">In plain terms: </w:t>
+      </w:r>
+      <w:r>
+        <w:rPr>
+          <w:rFonts w:ascii="Arial" w:cs="Arial" w:eastAsia="Arial" w:hAnsi="Arial"/>
+          <w:color w:val="444444"/>
+          <w:sz w:val="20"/>
+          <w:szCs w:val="20"/>
+        </w:rPr>
+        <w:t xml:space="preserve">In football there are three possible outcomes: home win, draw, or away win. Random guessing gives you a 33% chance of being right. BetsPlug scores an average of 49% — that is 48% better than random guessing. The “Pick of the Day” (the best daily prediction) scores an impressive 71%.</w:t>
+      </w:r>
+    </w:p>
     <w:p>
       <w:pPr>
         <w:pStyle w:val="Heading1"/>
@@ -1907,7 +1799,7 @@
           <w:sz w:val="32"/>
           <w:szCs w:val="32"/>
         </w:rPr>
-        <w:t xml:space="preserve">4. Data Integrity &amp; Transparency</w:t>
+        <w:t xml:space="preserve">4. Honesty &amp; Transparency</w:t>
       </w:r>
     </w:p>
     <w:p>
@@ -1924,7 +1816,20 @@
           <w:sz w:val="26"/>
           <w:szCs w:val="26"/>
         </w:rPr>
-        <w:t xml:space="preserve">4.1 Two-Track Record System</w:t>
+        <w:t xml:space="preserve">4.1 Two Separate Track Records</w:t>
+      </w:r>
+    </w:p>
+    <w:p>
+      <w:pPr>
+        <w:spacing w:after="140" w:line="320"/>
+      </w:pPr>
+      <w:r>
+        <w:rPr>
+          <w:rFonts w:ascii="Arial" w:cs="Arial" w:eastAsia="Arial" w:hAnsi="Arial"/>
+          <w:sz w:val="22"/>
+          <w:szCs w:val="22"/>
+        </w:rPr>
+        <w:t xml:space="preserve">BetsPlug maintains two separate scorecards:</w:t>
       </w:r>
     </w:p>
     <w:p>
@@ -1934,15 +1839,15 @@
           <w:ilvl w:val="0"/>
           <w:numId w:val="2"/>
         </w:numPr>
-        <w:spacing w:after="60"/>
-      </w:pPr>
-      <w:r>
-        <w:rPr>
-          <w:rFonts w:ascii="Arial" w:cs="Arial" w:eastAsia="Arial" w:hAnsi="Arial"/>
-          <w:sz w:val="22"/>
-          <w:szCs w:val="22"/>
-        </w:rPr>
-        <w:t xml:space="preserve">Live track record: only genuine pre-match predictions with timestamp proof</w:t>
+        <w:spacing w:after="80" w:line="320"/>
+      </w:pPr>
+      <w:r>
+        <w:rPr>
+          <w:rFonts w:ascii="Arial" w:cs="Arial" w:eastAsia="Arial" w:hAnsi="Arial"/>
+          <w:sz w:val="22"/>
+          <w:szCs w:val="22"/>
+        </w:rPr>
+        <w:t xml:space="preserve">Live track record: only predictions demonstrably made BEFORE the match, with timestamp proof</w:t>
       </w:r>
     </w:p>
     <w:p>
@@ -1952,15 +1857,58 @@
           <w:ilvl w:val="0"/>
           <w:numId w:val="2"/>
         </w:numPr>
-        <w:spacing w:after="60"/>
-      </w:pPr>
-      <w:r>
-        <w:rPr>
-          <w:rFonts w:ascii="Arial" w:cs="Arial" w:eastAsia="Arial" w:hAnsi="Arial"/>
-          <w:sz w:val="22"/>
-          <w:szCs w:val="22"/>
-        </w:rPr>
-        <w:t xml:space="preserve">Backtest track record: historical simulations clearly labeled as such</w:t>
+        <w:spacing w:after="80" w:line="320"/>
+      </w:pPr>
+      <w:r>
+        <w:rPr>
+          <w:rFonts w:ascii="Arial" w:cs="Arial" w:eastAsia="Arial" w:hAnsi="Arial"/>
+          <w:sz w:val="22"/>
+          <w:szCs w:val="22"/>
+        </w:rPr>
+        <w:t xml:space="preserve">Backtest track record: historical simulations, clearly labelled as such</w:t>
+      </w:r>
+    </w:p>
+    <w:p>
+      <w:pPr>
+        <w:spacing w:after="140" w:line="320"/>
+      </w:pPr>
+      <w:r>
+        <w:rPr>
+          <w:rFonts w:ascii="Arial" w:cs="Arial" w:eastAsia="Arial" w:hAnsi="Arial"/>
+          <w:sz w:val="22"/>
+          <w:szCs w:val="22"/>
+        </w:rPr>
+        <w:t xml:space="preserve">Users can filter which type they want to see via the API and website. CSV exports always include the source (live or backtest), hours before kickoff, and all evaluation data.</w:t>
+      </w:r>
+    </w:p>
+    <w:p>
+      <w:pPr>
+        <w:pStyle w:val="Heading2"/>
+        <w:spacing w:after="160" w:before="280"/>
+      </w:pPr>
+      <w:r>
+        <w:rPr>
+          <w:rFonts w:ascii="Arial" w:cs="Arial" w:eastAsia="Arial" w:hAnsi="Arial"/>
+          <w:b/>
+          <w:bCs/>
+          <w:color w:val="1a365d"/>
+          <w:sz w:val="26"/>
+          <w:szCs w:val="26"/>
+        </w:rPr>
+        <w:t xml:space="preserve">4.2 Honest Financial Calculations</w:t>
+      </w:r>
+    </w:p>
+    <w:p>
+      <w:pPr>
+        <w:spacing w:after="140" w:line="320"/>
+      </w:pPr>
+      <w:r>
+        <w:rPr>
+          <w:rFonts w:ascii="Arial" w:cs="Arial" w:eastAsia="Arial" w:hAnsi="Arial"/>
+          <w:sz w:val="22"/>
+          <w:szCs w:val="22"/>
+        </w:rPr>
+        <w:t xml:space="preserve">Profit and loss calculations are made exclusively using real bookmaker odds from licensed data sources (such as Bet365, Pinnacle). The system does NOT calculate fake profits based on its own probability estimates — that would amount to self-assessment.</w:t>
       </w:r>
     </w:p>
     <w:p>
@@ -1970,15 +1918,15 @@
           <w:ilvl w:val="0"/>
           <w:numId w:val="2"/>
         </w:numPr>
-        <w:spacing w:after="60"/>
-      </w:pPr>
-      <w:r>
-        <w:rPr>
-          <w:rFonts w:ascii="Arial" w:cs="Arial" w:eastAsia="Arial" w:hAnsi="Arial"/>
-          <w:sz w:val="22"/>
-          <w:szCs w:val="22"/>
-        </w:rPr>
-        <w:t xml:space="preserve">API filtering: ?source=live or ?source=backtest for all metrics endpoints</w:t>
+        <w:spacing w:after="80" w:line="320"/>
+      </w:pPr>
+      <w:r>
+        <w:rPr>
+          <w:rFonts w:ascii="Arial" w:cs="Arial" w:eastAsia="Arial" w:hAnsi="Arial"/>
+          <w:sz w:val="22"/>
+          <w:szCs w:val="22"/>
+        </w:rPr>
+        <w:t xml:space="preserve">When real odds are available: P/L is calculated based on those odds</w:t>
       </w:r>
     </w:p>
     <w:p>
@@ -1988,15 +1936,60 @@
           <w:ilvl w:val="0"/>
           <w:numId w:val="2"/>
         </w:numPr>
-        <w:spacing w:after="60"/>
-      </w:pPr>
-      <w:r>
-        <w:rPr>
-          <w:rFonts w:ascii="Arial" w:cs="Arial" w:eastAsia="Arial" w:hAnsi="Arial"/>
-          <w:sz w:val="22"/>
-          <w:szCs w:val="22"/>
-        </w:rPr>
-        <w:t xml:space="preserve">CSV export: includes prediction source, lead time, and all evaluation metrics</w:t>
+        <w:spacing w:after="80" w:line="320"/>
+      </w:pPr>
+      <w:r>
+        <w:rPr>
+          <w:rFonts w:ascii="Arial" w:cs="Arial" w:eastAsia="Arial" w:hAnsi="Arial"/>
+          <w:sz w:val="22"/>
+          <w:szCs w:val="22"/>
+        </w:rPr>
+        <w:t xml:space="preserve">When no real odds are available: P/L is reported as “unknown”, not estimated</w:t>
+      </w:r>
+    </w:p>
+    <w:p>
+      <w:pPr>
+        <w:pStyle w:val="ListParagraph"/>
+        <w:numPr>
+          <w:ilvl w:val="0"/>
+          <w:numId w:val="2"/>
+        </w:numPr>
+        <w:spacing w:after="80" w:line="320"/>
+      </w:pPr>
+      <w:r>
+        <w:rPr>
+          <w:rFonts w:ascii="Arial" w:cs="Arial" w:eastAsia="Arial" w:hAnsi="Arial"/>
+          <w:sz w:val="22"/>
+          <w:szCs w:val="22"/>
+        </w:rPr>
+        <w:t xml:space="preserve">Every metric discloses what percentage of picks had real odds data</w:t>
+      </w:r>
+    </w:p>
+    <w:p>
+      <w:pPr>
+        <w:shd w:fill="f5f5f5" w:val="clear"/>
+        <w:spacing w:after="160" w:before="80" w:line="320"/>
+        <w:ind w:left="200" w:right="200"/>
+      </w:pPr>
+      <w:r>
+        <w:rPr>
+          <w:rFonts w:ascii="Arial" w:cs="Arial" w:eastAsia="Arial" w:hAnsi="Arial"/>
+          <w:b/>
+          <w:bCs/>
+          <w:color w:val="1a365d"/>
+          <w:sz w:val="20"/>
+          <w:szCs w:val="20"/>
+        </w:rPr>
+        <w:t xml:space="preserve">In plain terms: </w:t>
+      </w:r>
+      <w:r>
+        <w:rPr>
+          <w:rFonts w:ascii="Arial" w:cs="Arial" w:eastAsia="Arial" w:hAnsi="Arial"/>
+          <w:color w:val="444444"/>
+          <w:sz w:val="20"/>
+          <w:szCs w:val="20"/>
+        </w:rPr>
+        <w:t xml:space="preserve">Say the model predicts “60% chance of home win.” If we then calculate odds ourselves (1/0.60 = 1.67) and claim “we made a profit!” then the model is grading its own homework. BetsPlug does not do this — we only use real bookmaker odds.</w:t>
       </w:r>
     </w:p>
     <w:p>
@@ -2013,79 +2006,52 @@
           <w:sz w:val="26"/>
           <w:szCs w:val="26"/>
         </w:rPr>
-        <w:t xml:space="preserve">4.2 Financial Calculations</w:t>
-      </w:r>
-    </w:p>
-    <w:p>
-      <w:pPr>
-        <w:pStyle w:val="ListParagraph"/>
-        <w:numPr>
-          <w:ilvl w:val="0"/>
-          <w:numId w:val="2"/>
-        </w:numPr>
-        <w:spacing w:after="60"/>
-      </w:pPr>
-      <w:r>
-        <w:rPr>
-          <w:rFonts w:ascii="Arial" w:cs="Arial" w:eastAsia="Arial" w:hAnsi="Arial"/>
-          <w:sz w:val="22"/>
-          <w:szCs w:val="22"/>
-        </w:rPr>
-        <w:t xml:space="preserve">P/L calculated exclusively with real bookmaker odds from licensed data sources</w:t>
-      </w:r>
-    </w:p>
-    <w:p>
-      <w:pPr>
-        <w:pStyle w:val="ListParagraph"/>
-        <w:numPr>
-          <w:ilvl w:val="0"/>
-          <w:numId w:val="2"/>
-        </w:numPr>
-        <w:spacing w:after="60"/>
-      </w:pPr>
-      <w:r>
-        <w:rPr>
-          <w:rFonts w:ascii="Arial" w:cs="Arial" w:eastAsia="Arial" w:hAnsi="Arial"/>
-          <w:sz w:val="22"/>
-          <w:szCs w:val="22"/>
-        </w:rPr>
-        <w:t xml:space="preserve">No circular implied-odds calculations (model evaluating itself)</w:t>
-      </w:r>
-    </w:p>
-    <w:p>
-      <w:pPr>
-        <w:pStyle w:val="ListParagraph"/>
-        <w:numPr>
-          <w:ilvl w:val="0"/>
-          <w:numId w:val="2"/>
-        </w:numPr>
-        <w:spacing w:after="60"/>
-      </w:pPr>
-      <w:r>
-        <w:rPr>
-          <w:rFonts w:ascii="Arial" w:cs="Arial" w:eastAsia="Arial" w:hAnsi="Arial"/>
-          <w:sz w:val="22"/>
-          <w:szCs w:val="22"/>
-        </w:rPr>
-        <w:t xml:space="preserve">When no real odds are available, P/L is reported as null, not estimated</w:t>
-      </w:r>
-    </w:p>
-    <w:p>
-      <w:pPr>
-        <w:pStyle w:val="ListParagraph"/>
-        <w:numPr>
-          <w:ilvl w:val="0"/>
-          <w:numId w:val="2"/>
-        </w:numPr>
-        <w:spacing w:after="60"/>
-      </w:pPr>
-      <w:r>
-        <w:rPr>
-          <w:rFonts w:ascii="Arial" w:cs="Arial" w:eastAsia="Arial" w:hAnsi="Arial"/>
-          <w:sz w:val="22"/>
-          <w:szCs w:val="22"/>
-        </w:rPr>
-        <w:t xml:space="preserve">Odds coverage percentage disclosed transparently for every metric</w:t>
+        <w:t xml:space="preserve">4.3 Mandatory Disclaimers</w:t>
+      </w:r>
+    </w:p>
+    <w:p>
+      <w:pPr>
+        <w:spacing w:after="140" w:line="320"/>
+      </w:pPr>
+      <w:r>
+        <w:rPr>
+          <w:rFonts w:ascii="Arial" w:cs="Arial" w:eastAsia="Arial" w:hAnsi="Arial"/>
+          <w:sz w:val="22"/>
+          <w:szCs w:val="22"/>
+        </w:rPr>
+        <w:t xml:space="preserve">Every prediction shown by BetsPlug includes the following disclaimer:</w:t>
+      </w:r>
+    </w:p>
+    <w:p>
+      <w:pPr>
+        <w:spacing w:after="140" w:line="320"/>
+      </w:pPr>
+      <w:r>
+        <w:rPr>
+          <w:rFonts w:ascii="Arial" w:cs="Arial" w:eastAsia="Arial" w:hAnsi="Arial"/>
+          <w:i/>
+          <w:iCs/>
+          <w:sz w:val="20"/>
+          <w:szCs w:val="20"/>
+        </w:rPr>
+        <w:t xml:space="preserve">“SIMULATION / EDUCATIONAL USE ONLY. These probability estimates are generated by a statistical model for research and educational purposes. They do NOT constitute financial, betting, or investment advice. Past model performance is not indicative of future results. Always gamble responsibly and within applicable laws.”</w:t>
+      </w:r>
+    </w:p>
+    <w:p>
+      <w:pPr>
+        <w:pStyle w:val="Heading1"/>
+        <w:spacing w:after="200" w:before="360"/>
+      </w:pPr>
+      <w:r>
+        <w:rPr>
+          <w:rFonts w:ascii="Arial" w:cs="Arial" w:eastAsia="Arial" w:hAnsi="Arial"/>
+          <w:b/>
+          <w:bCs/>
+          <w:color w:val="1a365d"/>
+          <w:sz w:val="32"/>
+          <w:szCs w:val="32"/>
+        </w:rPr>
+        <w:t xml:space="preserve">5. Legal Framework</w:t>
       </w:r>
     </w:p>
     <w:p>
@@ -2102,288 +2068,20 @@
           <w:sz w:val="26"/>
           <w:szCs w:val="26"/>
         </w:rPr>
-        <w:t xml:space="preserve">4.3 Mandatory Disclaimers</w:t>
-      </w:r>
-    </w:p>
-    <w:p>
-      <w:pPr>
-        <w:spacing w:after="120"/>
-      </w:pPr>
-      <w:r>
-        <w:rPr>
-          <w:rFonts w:ascii="Arial" w:cs="Arial" w:eastAsia="Arial" w:hAnsi="Arial"/>
-          <w:i/>
-          <w:iCs/>
-          <w:sz w:val="22"/>
-          <w:szCs w:val="22"/>
-        </w:rPr>
-        <w:t xml:space="preserve">Every API response and UI component carrying prediction data includes:</w:t>
-      </w:r>
-    </w:p>
-    <w:p>
-      <w:pPr>
-        <w:spacing w:after="120"/>
-      </w:pPr>
-      <w:r>
-        <w:rPr>
-          <w:rFonts w:ascii="Arial" w:cs="Arial" w:eastAsia="Arial" w:hAnsi="Arial"/>
-          <w:i/>
-          <w:iCs/>
-          <w:sz w:val="20"/>
-          <w:szCs w:val="20"/>
-        </w:rPr>
-        <w:t xml:space="preserve">"SIMULATION / EDUCATIONAL USE ONLY. These probability estimates are generated by a statistical model for research and educational purposes. They do NOT constitute financial, betting, or investment advice. Past model performance is not indicative of future results. Always gamble responsibly and within applicable laws."</w:t>
-      </w:r>
-    </w:p>
-    <w:p>
-      <w:pPr>
-        <w:pStyle w:val="Heading1"/>
-        <w:spacing w:after="200" w:before="360"/>
-      </w:pPr>
-      <w:r>
-        <w:rPr>
-          <w:rFonts w:ascii="Arial" w:cs="Arial" w:eastAsia="Arial" w:hAnsi="Arial"/>
-          <w:b/>
-          <w:bCs/>
-          <w:color w:val="1a365d"/>
-          <w:sz w:val="32"/>
-          <w:szCs w:val="32"/>
-        </w:rPr>
-        <w:t xml:space="preserve">5. Legal Framework</w:t>
-      </w:r>
-    </w:p>
-    <w:p>
-      <w:pPr>
-        <w:pStyle w:val="Heading2"/>
-        <w:spacing w:after="160" w:before="280"/>
-      </w:pPr>
-      <w:r>
-        <w:rPr>
-          <w:rFonts w:ascii="Arial" w:cs="Arial" w:eastAsia="Arial" w:hAnsi="Arial"/>
-          <w:b/>
-          <w:bCs/>
-          <w:color w:val="1a365d"/>
-          <w:sz w:val="26"/>
-          <w:szCs w:val="26"/>
-        </w:rPr>
-        <w:t xml:space="preserve">5.1 Regulatory Classification</w:t>
-      </w:r>
-    </w:p>
-    <w:p>
-      <w:pPr>
-        <w:spacing w:after="120"/>
-      </w:pPr>
-      <w:r>
-        <w:rPr>
-          <w:rFonts w:ascii="Arial" w:cs="Arial" w:eastAsia="Arial" w:hAnsi="Arial"/>
-          <w:sz w:val="22"/>
-          <w:szCs w:val="22"/>
-        </w:rPr>
-        <w:t xml:space="preserve">BetsPlug provides statistical analysis and educational content. It is expressly NOT:</w:t>
-      </w:r>
-    </w:p>
-    <w:p>
-      <w:pPr>
-        <w:pStyle w:val="ListParagraph"/>
-        <w:numPr>
-          <w:ilvl w:val="0"/>
-          <w:numId w:val="2"/>
-        </w:numPr>
-        <w:spacing w:after="60"/>
-      </w:pPr>
-      <w:r>
-        <w:rPr>
-          <w:rFonts w:ascii="Arial" w:cs="Arial" w:eastAsia="Arial" w:hAnsi="Arial"/>
-          <w:sz w:val="22"/>
-          <w:szCs w:val="22"/>
-        </w:rPr>
-        <w:t xml:space="preserve">A gambling operator — no wagers are accepted or facilitated</w:t>
-      </w:r>
-    </w:p>
-    <w:p>
-      <w:pPr>
-        <w:pStyle w:val="ListParagraph"/>
-        <w:numPr>
-          <w:ilvl w:val="0"/>
-          <w:numId w:val="2"/>
-        </w:numPr>
-        <w:spacing w:after="60"/>
-      </w:pPr>
-      <w:r>
-        <w:rPr>
-          <w:rFonts w:ascii="Arial" w:cs="Arial" w:eastAsia="Arial" w:hAnsi="Arial"/>
-          <w:sz w:val="22"/>
-          <w:szCs w:val="22"/>
-        </w:rPr>
-        <w:t xml:space="preserve">A tipster service — no returns are guaranteed or implied</w:t>
-      </w:r>
-    </w:p>
-    <w:p>
-      <w:pPr>
-        <w:pStyle w:val="ListParagraph"/>
-        <w:numPr>
-          <w:ilvl w:val="0"/>
-          <w:numId w:val="2"/>
-        </w:numPr>
-        <w:spacing w:after="60"/>
-      </w:pPr>
-      <w:r>
-        <w:rPr>
-          <w:rFonts w:ascii="Arial" w:cs="Arial" w:eastAsia="Arial" w:hAnsi="Arial"/>
-          <w:sz w:val="22"/>
-          <w:szCs w:val="22"/>
-        </w:rPr>
-        <w:t xml:space="preserve">Financial advice — no investment or betting guidance is provided</w:t>
-      </w:r>
-    </w:p>
-    <w:p>
-      <w:pPr>
-        <w:spacing w:after="120"/>
-      </w:pPr>
-      <w:r>
-        <w:rPr>
-          <w:rFonts w:ascii="Arial" w:cs="Arial" w:eastAsia="Arial" w:hAnsi="Arial"/>
-          <w:sz w:val="22"/>
-          <w:szCs w:val="22"/>
-        </w:rPr>
-        <w:t xml:space="preserve">The platform operates as an information and analytics service under applicable EU Digital Services Act provisions and national information service regulations.</w:t>
-      </w:r>
-    </w:p>
-    <w:p>
-      <w:pPr>
-        <w:pStyle w:val="Heading2"/>
-        <w:spacing w:after="160" w:before="280"/>
-      </w:pPr>
-      <w:r>
-        <w:rPr>
-          <w:rFonts w:ascii="Arial" w:cs="Arial" w:eastAsia="Arial" w:hAnsi="Arial"/>
-          <w:b/>
-          <w:bCs/>
-          <w:color w:val="1a365d"/>
-          <w:sz w:val="26"/>
-          <w:szCs w:val="26"/>
-        </w:rPr>
-        <w:t xml:space="preserve">5.2 Responsible Gambling Compliance</w:t>
-      </w:r>
-    </w:p>
-    <w:p>
-      <w:pPr>
-        <w:pStyle w:val="ListParagraph"/>
-        <w:numPr>
-          <w:ilvl w:val="0"/>
-          <w:numId w:val="2"/>
-        </w:numPr>
-        <w:spacing w:after="60"/>
-      </w:pPr>
-      <w:r>
-        <w:rPr>
-          <w:rFonts w:ascii="Arial" w:cs="Arial" w:eastAsia="Arial" w:hAnsi="Arial"/>
-          <w:sz w:val="22"/>
-          <w:szCs w:val="22"/>
-        </w:rPr>
-        <w:t xml:space="preserve">Mandatory simulation/educational disclaimer on all prediction outputs</w:t>
-      </w:r>
-    </w:p>
-    <w:p>
-      <w:pPr>
-        <w:pStyle w:val="ListParagraph"/>
-        <w:numPr>
-          <w:ilvl w:val="0"/>
-          <w:numId w:val="2"/>
-        </w:numPr>
-        <w:spacing w:after="60"/>
-      </w:pPr>
-      <w:r>
-        <w:rPr>
-          <w:rFonts w:ascii="Arial" w:cs="Arial" w:eastAsia="Arial" w:hAnsi="Arial"/>
-          <w:sz w:val="22"/>
-          <w:szCs w:val="22"/>
-        </w:rPr>
-        <w:t xml:space="preserve">No guarantee of accuracy or profitability — explicitly disclaimed</w:t>
-      </w:r>
-    </w:p>
-    <w:p>
-      <w:pPr>
-        <w:pStyle w:val="ListParagraph"/>
-        <w:numPr>
-          <w:ilvl w:val="0"/>
-          <w:numId w:val="2"/>
-        </w:numPr>
-        <w:spacing w:after="60"/>
-      </w:pPr>
-      <w:r>
-        <w:rPr>
-          <w:rFonts w:ascii="Arial" w:cs="Arial" w:eastAsia="Arial" w:hAnsi="Arial"/>
-          <w:sz w:val="22"/>
-          <w:szCs w:val="22"/>
-        </w:rPr>
-        <w:t xml:space="preserve">"Past performance is not indicative of future results" messaging</w:t>
-      </w:r>
-    </w:p>
-    <w:p>
-      <w:pPr>
-        <w:pStyle w:val="ListParagraph"/>
-        <w:numPr>
-          <w:ilvl w:val="0"/>
-          <w:numId w:val="2"/>
-        </w:numPr>
-        <w:spacing w:after="60"/>
-      </w:pPr>
-      <w:r>
-        <w:rPr>
-          <w:rFonts w:ascii="Arial" w:cs="Arial" w:eastAsia="Arial" w:hAnsi="Arial"/>
-          <w:sz w:val="22"/>
-          <w:szCs w:val="22"/>
-        </w:rPr>
-        <w:t xml:space="preserve">Age verification (18+) required for subscription purchases via Stripe</w:t>
-      </w:r>
-    </w:p>
-    <w:p>
-      <w:pPr>
-        <w:pStyle w:val="ListParagraph"/>
-        <w:numPr>
-          <w:ilvl w:val="0"/>
-          <w:numId w:val="2"/>
-        </w:numPr>
-        <w:spacing w:after="60"/>
-      </w:pPr>
-      <w:r>
-        <w:rPr>
-          <w:rFonts w:ascii="Arial" w:cs="Arial" w:eastAsia="Arial" w:hAnsi="Arial"/>
-          <w:sz w:val="22"/>
-          <w:szCs w:val="22"/>
-        </w:rPr>
-        <w:t xml:space="preserve">Self-exclusion: users can delete accounts and all associated data</w:t>
-      </w:r>
-    </w:p>
-    <w:p>
-      <w:pPr>
-        <w:pStyle w:val="Heading2"/>
-        <w:spacing w:after="160" w:before="280"/>
-      </w:pPr>
-      <w:r>
-        <w:rPr>
-          <w:rFonts w:ascii="Arial" w:cs="Arial" w:eastAsia="Arial" w:hAnsi="Arial"/>
-          <w:b/>
-          <w:bCs/>
-          <w:color w:val="1a365d"/>
-          <w:sz w:val="26"/>
-          <w:szCs w:val="26"/>
-        </w:rPr>
-        <w:t xml:space="preserve">5.3 Data Protection (GDPR)</w:t>
-      </w:r>
-    </w:p>
-    <w:p>
-      <w:pPr>
-        <w:spacing w:after="120"/>
-      </w:pPr>
-      <w:r>
-        <w:rPr>
-          <w:rFonts w:ascii="Arial" w:cs="Arial" w:eastAsia="Arial" w:hAnsi="Arial"/>
-          <w:sz w:val="22"/>
-          <w:szCs w:val="22"/>
-        </w:rPr>
-        <w:t xml:space="preserve">The platform processes minimal personal data in compliance with GDPR:</w:t>
+        <w:t xml:space="preserve">5.1 What BetsPlug IS and IS NOT</w:t>
+      </w:r>
+    </w:p>
+    <w:p>
+      <w:pPr>
+        <w:spacing w:after="140" w:line="320"/>
+      </w:pPr>
+      <w:r>
+        <w:rPr>
+          <w:rFonts w:ascii="Arial" w:cs="Arial" w:eastAsia="Arial" w:hAnsi="Arial"/>
+          <w:sz w:val="22"/>
+          <w:szCs w:val="22"/>
+        </w:rPr>
+        <w:t xml:space="preserve">BetsPlug is an information service offering statistical analysis. It is important to understand what the platform IS and IS NOT:</w:t>
       </w:r>
     </w:p>
     <w:tbl>
@@ -2429,7 +2127,7 @@
                 <w:sz w:val="20"/>
                 <w:szCs w:val="20"/>
               </w:rPr>
-              <w:t xml:space="preserve">Data Category</w:t>
+              <w:t xml:space="preserve">BetsPlug IS</w:t>
             </w:r>
           </w:p>
         </w:tc>
@@ -2459,7 +2157,7 @@
                 <w:sz w:val="20"/>
                 <w:szCs w:val="20"/>
               </w:rPr>
-              <w:t xml:space="preserve">Processing Basis</w:t>
+              <w:t xml:space="preserve">BetsPlug IS NOT</w:t>
             </w:r>
           </w:p>
         </w:tc>
@@ -2491,7 +2189,7 @@
                 <w:sz w:val="20"/>
                 <w:szCs w:val="20"/>
               </w:rPr>
-              <w:t xml:space="preserve">Email, username</w:t>
+              <w:t xml:space="preserve">An information platform with AI analyses</w:t>
             </w:r>
           </w:p>
         </w:tc>
@@ -2521,7 +2219,7 @@
                 <w:sz w:val="20"/>
                 <w:szCs w:val="20"/>
               </w:rPr>
-              <w:t xml:space="preserve">Contract performance (account creation)</w:t>
+              <w:t xml:space="preserve">A gambling company or casino</w:t>
             </w:r>
           </w:p>
         </w:tc>
@@ -2553,7 +2251,7 @@
                 <w:sz w:val="20"/>
                 <w:szCs w:val="20"/>
               </w:rPr>
-              <w:t xml:space="preserve">Subscription status</w:t>
+              <w:t xml:space="preserve">An educational service about sports statistics</w:t>
             </w:r>
           </w:p>
         </w:tc>
@@ -2583,7 +2281,7 @@
                 <w:sz w:val="20"/>
                 <w:szCs w:val="20"/>
               </w:rPr>
-              <w:t xml:space="preserve">Contract performance</w:t>
+              <w:t xml:space="preserve">A tipster service guaranteeing profits</w:t>
             </w:r>
           </w:p>
         </w:tc>
@@ -2615,7 +2313,7 @@
                 <w:sz w:val="20"/>
                 <w:szCs w:val="20"/>
               </w:rPr>
-              <w:t xml:space="preserve">Abandoned checkout email</w:t>
+              <w:t xml:space="preserve">A subscription service for data insights</w:t>
             </w:r>
           </w:p>
         </w:tc>
@@ -2645,136 +2343,55 @@
                 <w:sz w:val="20"/>
                 <w:szCs w:val="20"/>
               </w:rPr>
-              <w:t xml:space="preserve">Legitimate interest (single reminder)</w:t>
-            </w:r>
-          </w:p>
-        </w:tc>
-      </w:tr>
-      <w:tr>
-        <w:tc>
-          <w:tcPr>
-            <w:tcW w:type="dxa" w:w="4500"/>
-            <w:tcBorders>
-              <w:top w:val="single" w:color="cccccc" w:sz="1"/>
-              <w:left w:val="single" w:color="cccccc" w:sz="1"/>
-              <w:bottom w:val="single" w:color="cccccc" w:sz="1"/>
-              <w:right w:val="single" w:color="cccccc" w:sz="1"/>
-            </w:tcBorders>
-            <w:shd w:fill="ffffff" w:val="clear"/>
-            <w:tcMar>
-              <w:top w:type="dxa" w:w="80"/>
-              <w:left w:type="dxa" w:w="120"/>
-              <w:bottom w:type="dxa" w:w="80"/>
-              <w:right w:type="dxa" w:w="120"/>
-            </w:tcMar>
-          </w:tcPr>
-          <w:p>
-            <w:r>
-              <w:rPr>
-                <w:rFonts w:ascii="Arial" w:cs="Arial" w:eastAsia="Arial" w:hAnsi="Arial"/>
-                <w:b w:val="false"/>
-                <w:bCs w:val="false"/>
-                <w:sz w:val="20"/>
-                <w:szCs w:val="20"/>
-              </w:rPr>
-              <w:t xml:space="preserve">Payment data</w:t>
-            </w:r>
-          </w:p>
-        </w:tc>
-        <w:tc>
-          <w:tcPr>
-            <w:tcW w:type="dxa" w:w="4526"/>
-            <w:tcBorders>
-              <w:top w:val="single" w:color="cccccc" w:sz="1"/>
-              <w:left w:val="single" w:color="cccccc" w:sz="1"/>
-              <w:bottom w:val="single" w:color="cccccc" w:sz="1"/>
-              <w:right w:val="single" w:color="cccccc" w:sz="1"/>
-            </w:tcBorders>
-            <w:shd w:fill="ffffff" w:val="clear"/>
-            <w:tcMar>
-              <w:top w:type="dxa" w:w="80"/>
-              <w:left w:type="dxa" w:w="120"/>
-              <w:bottom w:type="dxa" w:w="80"/>
-              <w:right w:type="dxa" w:w="120"/>
-            </w:tcMar>
-          </w:tcPr>
-          <w:p>
-            <w:r>
-              <w:rPr>
-                <w:rFonts w:ascii="Arial" w:cs="Arial" w:eastAsia="Arial" w:hAnsi="Arial"/>
-                <w:b w:val="false"/>
-                <w:bCs w:val="false"/>
-                <w:sz w:val="20"/>
-                <w:szCs w:val="20"/>
-              </w:rPr>
-              <w:t xml:space="preserve">NOT stored — processed by Stripe (PCI-DSS Level 1)</w:t>
-            </w:r>
-          </w:p>
-        </w:tc>
-      </w:tr>
-      <w:tr>
-        <w:tc>
-          <w:tcPr>
-            <w:tcW w:type="dxa" w:w="4500"/>
-            <w:tcBorders>
-              <w:top w:val="single" w:color="cccccc" w:sz="1"/>
-              <w:left w:val="single" w:color="cccccc" w:sz="1"/>
-              <w:bottom w:val="single" w:color="cccccc" w:sz="1"/>
-              <w:right w:val="single" w:color="cccccc" w:sz="1"/>
-            </w:tcBorders>
-            <w:shd w:fill="ffffff" w:val="clear"/>
-            <w:tcMar>
-              <w:top w:type="dxa" w:w="80"/>
-              <w:left w:type="dxa" w:w="120"/>
-              <w:bottom w:type="dxa" w:w="80"/>
-              <w:right w:type="dxa" w:w="120"/>
-            </w:tcMar>
-          </w:tcPr>
-          <w:p>
-            <w:r>
-              <w:rPr>
-                <w:rFonts w:ascii="Arial" w:cs="Arial" w:eastAsia="Arial" w:hAnsi="Arial"/>
-                <w:b w:val="false"/>
-                <w:bCs w:val="false"/>
-                <w:sz w:val="20"/>
-                <w:szCs w:val="20"/>
-              </w:rPr>
-              <w:t xml:space="preserve">Prediction history</w:t>
-            </w:r>
-          </w:p>
-        </w:tc>
-        <w:tc>
-          <w:tcPr>
-            <w:tcW w:type="dxa" w:w="4526"/>
-            <w:tcBorders>
-              <w:top w:val="single" w:color="cccccc" w:sz="1"/>
-              <w:left w:val="single" w:color="cccccc" w:sz="1"/>
-              <w:bottom w:val="single" w:color="cccccc" w:sz="1"/>
-              <w:right w:val="single" w:color="cccccc" w:sz="1"/>
-            </w:tcBorders>
-            <w:shd w:fill="ffffff" w:val="clear"/>
-            <w:tcMar>
-              <w:top w:type="dxa" w:w="80"/>
-              <w:left w:type="dxa" w:w="120"/>
-              <w:bottom w:type="dxa" w:w="80"/>
-              <w:right w:type="dxa" w:w="120"/>
-            </w:tcMar>
-          </w:tcPr>
-          <w:p>
-            <w:r>
-              <w:rPr>
-                <w:rFonts w:ascii="Arial" w:cs="Arial" w:eastAsia="Arial" w:hAnsi="Arial"/>
-                <w:b w:val="false"/>
-                <w:bCs w:val="false"/>
-                <w:sz w:val="20"/>
-                <w:szCs w:val="20"/>
-              </w:rPr>
-              <w:t xml:space="preserve">Contract performance (service delivery)</w:t>
+              <w:t xml:space="preserve">Financial or investment advice</w:t>
             </w:r>
           </w:p>
         </w:tc>
       </w:tr>
     </w:tbl>
+    <w:p>
+      <w:pPr>
+        <w:spacing w:after="140" w:line="320"/>
+      </w:pPr>
+      <w:r>
+        <w:rPr>
+          <w:rFonts w:ascii="Arial" w:cs="Arial" w:eastAsia="Arial" w:hAnsi="Arial"/>
+          <w:sz w:val="22"/>
+          <w:szCs w:val="22"/>
+        </w:rPr>
+        <w:t xml:space="preserve">BetsPlug does not accept wagers, organise bets, or facilitate gambling activities in any way. The platform falls under the EU Digital Services Act as an information service.</w:t>
+      </w:r>
+    </w:p>
+    <w:p>
+      <w:pPr>
+        <w:pStyle w:val="Heading2"/>
+        <w:spacing w:after="160" w:before="280"/>
+      </w:pPr>
+      <w:r>
+        <w:rPr>
+          <w:rFonts w:ascii="Arial" w:cs="Arial" w:eastAsia="Arial" w:hAnsi="Arial"/>
+          <w:b/>
+          <w:bCs/>
+          <w:color w:val="1a365d"/>
+          <w:sz w:val="26"/>
+          <w:szCs w:val="26"/>
+        </w:rPr>
+        <w:t xml:space="preserve">5.2 Responsible Gambling</w:t>
+      </w:r>
+    </w:p>
+    <w:p>
+      <w:pPr>
+        <w:spacing w:after="140" w:line="320"/>
+      </w:pPr>
+      <w:r>
+        <w:rPr>
+          <w:rFonts w:ascii="Arial" w:cs="Arial" w:eastAsia="Arial" w:hAnsi="Arial"/>
+          <w:sz w:val="22"/>
+          <w:szCs w:val="22"/>
+        </w:rPr>
+        <w:t xml:space="preserve">Although BetsPlug is not a gambling service itself, the platform acknowledges that some users may use the information in combination with gambling activities. Therefore, BetsPlug takes the following measures:</w:t>
+      </w:r>
+    </w:p>
     <w:p>
       <w:pPr>
         <w:pStyle w:val="ListParagraph"/>
@@ -2782,15 +2399,15 @@
           <w:ilvl w:val="0"/>
           <w:numId w:val="2"/>
         </w:numPr>
-        <w:spacing w:after="60"/>
-      </w:pPr>
-      <w:r>
-        <w:rPr>
-          <w:rFonts w:ascii="Arial" w:cs="Arial" w:eastAsia="Arial" w:hAnsi="Arial"/>
-          <w:sz w:val="22"/>
-          <w:szCs w:val="22"/>
-        </w:rPr>
-        <w:t xml:space="preserve">Right to erasure: users can delete accounts via settings or GDPR request</w:t>
+        <w:spacing w:after="80" w:line="320"/>
+      </w:pPr>
+      <w:r>
+        <w:rPr>
+          <w:rFonts w:ascii="Arial" w:cs="Arial" w:eastAsia="Arial" w:hAnsi="Arial"/>
+          <w:sz w:val="22"/>
+          <w:szCs w:val="22"/>
+        </w:rPr>
+        <w:t xml:space="preserve">Mandatory disclaimer on every prediction</w:t>
       </w:r>
     </w:p>
     <w:p>
@@ -2800,15 +2417,15 @@
           <w:ilvl w:val="0"/>
           <w:numId w:val="2"/>
         </w:numPr>
-        <w:spacing w:after="60"/>
-      </w:pPr>
-      <w:r>
-        <w:rPr>
-          <w:rFonts w:ascii="Arial" w:cs="Arial" w:eastAsia="Arial" w:hAnsi="Arial"/>
-          <w:sz w:val="22"/>
-          <w:szCs w:val="22"/>
-        </w:rPr>
-        <w:t xml:space="preserve">Data processing: EU-based infrastructure (Railway EU, Vercel EU edge)</w:t>
+        <w:spacing w:after="80" w:line="320"/>
+      </w:pPr>
+      <w:r>
+        <w:rPr>
+          <w:rFonts w:ascii="Arial" w:cs="Arial" w:eastAsia="Arial" w:hAnsi="Arial"/>
+          <w:sz w:val="22"/>
+          <w:szCs w:val="22"/>
+        </w:rPr>
+        <w:t xml:space="preserve">Clear statement that accuracy is not guaranteed</w:t>
       </w:r>
     </w:p>
     <w:p>
@@ -2818,15 +2435,51 @@
           <w:ilvl w:val="0"/>
           <w:numId w:val="2"/>
         </w:numPr>
-        <w:spacing w:after="60"/>
-      </w:pPr>
-      <w:r>
-        <w:rPr>
-          <w:rFonts w:ascii="Arial" w:cs="Arial" w:eastAsia="Arial" w:hAnsi="Arial"/>
-          <w:sz w:val="22"/>
-          <w:szCs w:val="22"/>
-        </w:rPr>
-        <w:t xml:space="preserve">No profiling for automated decision-making affecting users</w:t>
+        <w:spacing w:after="80" w:line="320"/>
+      </w:pPr>
+      <w:r>
+        <w:rPr>
+          <w:rFonts w:ascii="Arial" w:cs="Arial" w:eastAsia="Arial" w:hAnsi="Arial"/>
+          <w:sz w:val="22"/>
+          <w:szCs w:val="22"/>
+        </w:rPr>
+        <w:t xml:space="preserve">The message “Past results do not guarantee future performance”</w:t>
+      </w:r>
+    </w:p>
+    <w:p>
+      <w:pPr>
+        <w:pStyle w:val="ListParagraph"/>
+        <w:numPr>
+          <w:ilvl w:val="0"/>
+          <w:numId w:val="2"/>
+        </w:numPr>
+        <w:spacing w:after="80" w:line="320"/>
+      </w:pPr>
+      <w:r>
+        <w:rPr>
+          <w:rFonts w:ascii="Arial" w:cs="Arial" w:eastAsia="Arial" w:hAnsi="Arial"/>
+          <w:sz w:val="22"/>
+          <w:szCs w:val="22"/>
+        </w:rPr>
+        <w:t xml:space="preserve">Age verification (18+) required when purchasing a subscription</w:t>
+      </w:r>
+    </w:p>
+    <w:p>
+      <w:pPr>
+        <w:pStyle w:val="ListParagraph"/>
+        <w:numPr>
+          <w:ilvl w:val="0"/>
+          <w:numId w:val="2"/>
+        </w:numPr>
+        <w:spacing w:after="80" w:line="320"/>
+      </w:pPr>
+      <w:r>
+        <w:rPr>
+          <w:rFonts w:ascii="Arial" w:cs="Arial" w:eastAsia="Arial" w:hAnsi="Arial"/>
+          <w:sz w:val="22"/>
+          <w:szCs w:val="22"/>
+        </w:rPr>
+        <w:t xml:space="preserve">Self-exclusion option: users can completely delete their account</w:t>
       </w:r>
     </w:p>
     <w:p>
@@ -2843,372 +2496,20 @@
           <w:sz w:val="26"/>
           <w:szCs w:val="26"/>
         </w:rPr>
-        <w:t xml:space="preserve">5.4 Intellectual Property</w:t>
-      </w:r>
-    </w:p>
-    <w:p>
-      <w:pPr>
-        <w:pStyle w:val="ListParagraph"/>
-        <w:numPr>
-          <w:ilvl w:val="0"/>
-          <w:numId w:val="2"/>
-        </w:numPr>
-        <w:spacing w:after="60"/>
-      </w:pPr>
-      <w:r>
-        <w:rPr>
-          <w:rFonts w:ascii="Arial" w:cs="Arial" w:eastAsia="Arial" w:hAnsi="Arial"/>
-          <w:sz w:val="22"/>
-          <w:szCs w:val="22"/>
-        </w:rPr>
-        <w:t xml:space="preserve">Prediction engine: proprietary ensemble methodology developed in-house</w:t>
-      </w:r>
-    </w:p>
-    <w:p>
-      <w:pPr>
-        <w:pStyle w:val="ListParagraph"/>
-        <w:numPr>
-          <w:ilvl w:val="0"/>
-          <w:numId w:val="2"/>
-        </w:numPr>
-        <w:spacing w:after="60"/>
-      </w:pPr>
-      <w:r>
-        <w:rPr>
-          <w:rFonts w:ascii="Arial" w:cs="Arial" w:eastAsia="Arial" w:hAnsi="Arial"/>
-          <w:sz w:val="22"/>
-          <w:szCs w:val="22"/>
-        </w:rPr>
-        <w:t xml:space="preserve">Training data: licensed from API-Football (Pro tier commercial license)</w:t>
-      </w:r>
-    </w:p>
-    <w:p>
-      <w:pPr>
-        <w:pStyle w:val="ListParagraph"/>
-        <w:numPr>
-          <w:ilvl w:val="0"/>
-          <w:numId w:val="2"/>
-        </w:numPr>
-        <w:spacing w:after="60"/>
-      </w:pPr>
-      <w:r>
-        <w:rPr>
-          <w:rFonts w:ascii="Arial" w:cs="Arial" w:eastAsia="Arial" w:hAnsi="Arial"/>
-          <w:sz w:val="22"/>
-          <w:szCs w:val="22"/>
-        </w:rPr>
-        <w:t xml:space="preserve">Supplementary data: Football-Data.org (attribution license)</w:t>
-      </w:r>
-    </w:p>
-    <w:p>
-      <w:pPr>
-        <w:pStyle w:val="ListParagraph"/>
-        <w:numPr>
-          <w:ilvl w:val="0"/>
-          <w:numId w:val="2"/>
-        </w:numPr>
-        <w:spacing w:after="60"/>
-      </w:pPr>
-      <w:r>
-        <w:rPr>
-          <w:rFonts w:ascii="Arial" w:cs="Arial" w:eastAsia="Arial" w:hAnsi="Arial"/>
-          <w:sz w:val="22"/>
-          <w:szCs w:val="22"/>
-        </w:rPr>
-        <w:t xml:space="preserve">Odds data: licensed from The Odds API (commercial subscription)</w:t>
-      </w:r>
-    </w:p>
-    <w:p>
-      <w:pPr>
-        <w:pStyle w:val="ListParagraph"/>
-        <w:numPr>
-          <w:ilvl w:val="0"/>
-          <w:numId w:val="2"/>
-        </w:numPr>
-        <w:spacing w:after="60"/>
-      </w:pPr>
-      <w:r>
-        <w:rPr>
-          <w:rFonts w:ascii="Arial" w:cs="Arial" w:eastAsia="Arial" w:hAnsi="Arial"/>
-          <w:sz w:val="22"/>
-          <w:szCs w:val="22"/>
-        </w:rPr>
-        <w:t xml:space="preserve">All third-party data used within respective license terms</w:t>
-      </w:r>
-    </w:p>
-    <w:p>
-      <w:pPr>
-        <w:pStyle w:val="Heading1"/>
-        <w:spacing w:after="200" w:before="360"/>
-      </w:pPr>
-      <w:r>
-        <w:rPr>
-          <w:rFonts w:ascii="Arial" w:cs="Arial" w:eastAsia="Arial" w:hAnsi="Arial"/>
-          <w:b/>
-          <w:bCs/>
-          <w:color w:val="1a365d"/>
-          <w:sz w:val="32"/>
-          <w:szCs w:val="32"/>
-        </w:rPr>
-        <w:t xml:space="preserve">6. Risk Disclosure</w:t>
-      </w:r>
-    </w:p>
-    <w:p>
-      <w:pPr>
-        <w:spacing w:after="120"/>
-      </w:pPr>
-      <w:r>
-        <w:rPr>
-          <w:rFonts w:ascii="Arial" w:cs="Arial" w:eastAsia="Arial" w:hAnsi="Arial"/>
-          <w:sz w:val="22"/>
-          <w:szCs w:val="22"/>
-        </w:rPr>
-        <w:t xml:space="preserve">Users and stakeholders must understand the following inherent limitations:</w:t>
-      </w:r>
-    </w:p>
-    <w:p>
-      <w:pPr>
-        <w:pStyle w:val="ListParagraph"/>
-        <w:numPr>
-          <w:ilvl w:val="0"/>
-          <w:numId w:val="2"/>
-        </w:numPr>
-        <w:spacing w:after="60"/>
-      </w:pPr>
-      <w:r>
-        <w:rPr>
-          <w:rFonts w:ascii="Arial" w:cs="Arial" w:eastAsia="Arial" w:hAnsi="Arial"/>
-          <w:sz w:val="22"/>
-          <w:szCs w:val="22"/>
-        </w:rPr>
-        <w:t xml:space="preserve">Predictions are probabilistic estimates derived from historical patterns, not certainties</w:t>
-      </w:r>
-    </w:p>
-    <w:p>
-      <w:pPr>
-        <w:pStyle w:val="ListParagraph"/>
-        <w:numPr>
-          <w:ilvl w:val="0"/>
-          <w:numId w:val="2"/>
-        </w:numPr>
-        <w:spacing w:after="60"/>
-      </w:pPr>
-      <w:r>
-        <w:rPr>
-          <w:rFonts w:ascii="Arial" w:cs="Arial" w:eastAsia="Arial" w:hAnsi="Arial"/>
-          <w:sz w:val="22"/>
-          <w:szCs w:val="22"/>
-        </w:rPr>
-        <w:t xml:space="preserve">Historical accuracy (48.9% overall, 71.1% BOTD) does not guarantee future performance</w:t>
-      </w:r>
-    </w:p>
-    <w:p>
-      <w:pPr>
-        <w:pStyle w:val="ListParagraph"/>
-        <w:numPr>
-          <w:ilvl w:val="0"/>
-          <w:numId w:val="2"/>
-        </w:numPr>
-        <w:spacing w:after="60"/>
-      </w:pPr>
-      <w:r>
-        <w:rPr>
-          <w:rFonts w:ascii="Arial" w:cs="Arial" w:eastAsia="Arial" w:hAnsi="Arial"/>
-          <w:sz w:val="22"/>
-          <w:szCs w:val="22"/>
-        </w:rPr>
-        <w:t xml:space="preserve">Models may underperform during atypical conditions (e.g., pandemic disruptions, player strikes, rule changes)</w:t>
-      </w:r>
-    </w:p>
-    <w:p>
-      <w:pPr>
-        <w:pStyle w:val="ListParagraph"/>
-        <w:numPr>
-          <w:ilvl w:val="0"/>
-          <w:numId w:val="2"/>
-        </w:numPr>
-        <w:spacing w:after="60"/>
-      </w:pPr>
-      <w:r>
-        <w:rPr>
-          <w:rFonts w:ascii="Arial" w:cs="Arial" w:eastAsia="Arial" w:hAnsi="Arial"/>
-          <w:sz w:val="22"/>
-          <w:szCs w:val="22"/>
-        </w:rPr>
-        <w:t xml:space="preserve">League-level accuracy varies: top-6 European leagues achieve approximately 50%, while lower-tier leagues average approximately 40%</w:t>
-      </w:r>
-    </w:p>
-    <w:p>
-      <w:pPr>
-        <w:pStyle w:val="ListParagraph"/>
-        <w:numPr>
-          <w:ilvl w:val="0"/>
-          <w:numId w:val="2"/>
-        </w:numPr>
-        <w:spacing w:after="60"/>
-      </w:pPr>
-      <w:r>
-        <w:rPr>
-          <w:rFonts w:ascii="Arial" w:cs="Arial" w:eastAsia="Arial" w:hAnsi="Arial"/>
-          <w:sz w:val="22"/>
-          <w:szCs w:val="22"/>
-        </w:rPr>
-        <w:t xml:space="preserve">Users should never stake money they cannot afford to lose</w:t>
-      </w:r>
-    </w:p>
-    <w:p>
-      <w:pPr>
-        <w:pStyle w:val="ListParagraph"/>
-        <w:numPr>
-          <w:ilvl w:val="0"/>
-          <w:numId w:val="2"/>
-        </w:numPr>
-        <w:spacing w:after="60"/>
-      </w:pPr>
-      <w:r>
-        <w:rPr>
-          <w:rFonts w:ascii="Arial" w:cs="Arial" w:eastAsia="Arial" w:hAnsi="Arial"/>
-          <w:sz w:val="22"/>
-          <w:szCs w:val="22"/>
-        </w:rPr>
-        <w:t xml:space="preserve">BetsPlug accepts no liability for financial losses arising from the use of its predictions</w:t>
-      </w:r>
-    </w:p>
-    <w:p>
-      <w:pPr>
-        <w:pStyle w:val="Heading1"/>
-        <w:spacing w:after="200" w:before="360"/>
-      </w:pPr>
-      <w:r>
-        <w:rPr>
-          <w:rFonts w:ascii="Arial" w:cs="Arial" w:eastAsia="Arial" w:hAnsi="Arial"/>
-          <w:b/>
-          <w:bCs/>
-          <w:color w:val="1a365d"/>
-          <w:sz w:val="32"/>
-          <w:szCs w:val="32"/>
-        </w:rPr>
-        <w:t xml:space="preserve">7. Audit Trail &amp; Reproducibility</w:t>
-      </w:r>
-    </w:p>
-    <w:p>
-      <w:pPr>
-        <w:spacing w:after="120"/>
-      </w:pPr>
-      <w:r>
-        <w:rPr>
-          <w:rFonts w:ascii="Arial" w:cs="Arial" w:eastAsia="Arial" w:hAnsi="Arial"/>
-          <w:sz w:val="22"/>
-          <w:szCs w:val="22"/>
-        </w:rPr>
-        <w:t xml:space="preserve">The platform maintains a comprehensive audit trail for every prediction:</w:t>
-      </w:r>
-    </w:p>
-    <w:p>
-      <w:pPr>
-        <w:pStyle w:val="ListParagraph"/>
-        <w:numPr>
-          <w:ilvl w:val="0"/>
-          <w:numId w:val="2"/>
-        </w:numPr>
-        <w:spacing w:after="60"/>
-      </w:pPr>
-      <w:r>
-        <w:rPr>
-          <w:rFonts w:ascii="Arial" w:cs="Arial" w:eastAsia="Arial" w:hAnsi="Arial"/>
-          <w:sz w:val="22"/>
-          <w:szCs w:val="22"/>
-        </w:rPr>
-        <w:t xml:space="preserve">Immutable prediction record: timestamp, model version, 43-feature snapshot, raw model output</w:t>
-      </w:r>
-    </w:p>
-    <w:p>
-      <w:pPr>
-        <w:pStyle w:val="ListParagraph"/>
-        <w:numPr>
-          <w:ilvl w:val="0"/>
-          <w:numId w:val="2"/>
-        </w:numPr>
-        <w:spacing w:after="60"/>
-      </w:pPr>
-      <w:r>
-        <w:rPr>
-          <w:rFonts w:ascii="Arial" w:cs="Arial" w:eastAsia="Arial" w:hAnsi="Arial"/>
-          <w:sz w:val="22"/>
-          <w:szCs w:val="22"/>
-        </w:rPr>
-        <w:t xml:space="preserve">Evaluation records: link predictions to actual match outcomes with Brier score and log-loss</w:t>
-      </w:r>
-    </w:p>
-    <w:p>
-      <w:pPr>
-        <w:pStyle w:val="ListParagraph"/>
-        <w:numPr>
-          <w:ilvl w:val="0"/>
-          <w:numId w:val="2"/>
-        </w:numPr>
-        <w:spacing w:after="60"/>
-      </w:pPr>
-      <w:r>
-        <w:rPr>
-          <w:rFonts w:ascii="Arial" w:cs="Arial" w:eastAsia="Arial" w:hAnsi="Arial"/>
-          <w:sz w:val="22"/>
-          <w:szCs w:val="22"/>
-        </w:rPr>
-        <w:t xml:space="preserve">Full reproducibility: given identical features, the model produces identical output</w:t>
-      </w:r>
-    </w:p>
-    <w:p>
-      <w:pPr>
-        <w:pStyle w:val="ListParagraph"/>
-        <w:numPr>
-          <w:ilvl w:val="0"/>
-          <w:numId w:val="2"/>
-        </w:numPr>
-        <w:spacing w:after="60"/>
-      </w:pPr>
-      <w:r>
-        <w:rPr>
-          <w:rFonts w:ascii="Arial" w:cs="Arial" w:eastAsia="Arial" w:hAnsi="Arial"/>
-          <w:sz w:val="22"/>
-          <w:szCs w:val="22"/>
-        </w:rPr>
-        <w:t xml:space="preserve">Version control: all model changes documented in git history with commit messages</w:t>
-      </w:r>
-    </w:p>
-    <w:p>
-      <w:pPr>
-        <w:pStyle w:val="ListParagraph"/>
-        <w:numPr>
-          <w:ilvl w:val="0"/>
-          <w:numId w:val="2"/>
-        </w:numPr>
-        <w:spacing w:after="60"/>
-      </w:pPr>
-      <w:r>
-        <w:rPr>
-          <w:rFonts w:ascii="Arial" w:cs="Arial" w:eastAsia="Arial" w:hAnsi="Arial"/>
-          <w:sz w:val="22"/>
-          <w:szCs w:val="22"/>
-        </w:rPr>
-        <w:t xml:space="preserve">Database migrations: schema changes tracked via Alembic with up/down reversibility</w:t>
-      </w:r>
-    </w:p>
-    <w:p>
-      <w:pPr>
-        <w:pStyle w:val="Heading1"/>
-        <w:spacing w:after="200" w:before="360"/>
-      </w:pPr>
-      <w:r>
-        <w:rPr>
-          <w:rFonts w:ascii="Arial" w:cs="Arial" w:eastAsia="Arial" w:hAnsi="Arial"/>
-          <w:b/>
-          <w:bCs/>
-          <w:color w:val="1a365d"/>
-          <w:sz w:val="32"/>
-          <w:szCs w:val="32"/>
-        </w:rPr>
-        <w:t xml:space="preserve">8. Contact &amp; Governance</w:t>
+        <w:t xml:space="preserve">5.3 Privacy and Data Protection (GDPR)</w:t>
+      </w:r>
+    </w:p>
+    <w:p>
+      <w:pPr>
+        <w:spacing w:after="140" w:line="320"/>
+      </w:pPr>
+      <w:r>
+        <w:rPr>
+          <w:rFonts w:ascii="Arial" w:cs="Arial" w:eastAsia="Arial" w:hAnsi="Arial"/>
+          <w:sz w:val="22"/>
+          <w:szCs w:val="22"/>
+        </w:rPr>
+        <w:t xml:space="preserve">BetsPlug processes as little personal data as possible, in full compliance with the General Data Protection Regulation (GDPR):</w:t>
       </w:r>
     </w:p>
     <w:tbl>
@@ -3254,7 +2555,7 @@
                 <w:sz w:val="20"/>
                 <w:szCs w:val="20"/>
               </w:rPr>
-              <w:t xml:space="preserve">Item</w:t>
+              <w:t xml:space="preserve">What we store</w:t>
             </w:r>
           </w:p>
         </w:tc>
@@ -3284,7 +2585,7 @@
                 <w:sz w:val="20"/>
                 <w:szCs w:val="20"/>
               </w:rPr>
-              <w:t xml:space="preserve">Details</w:t>
+              <w:t xml:space="preserve">Why</w:t>
             </w:r>
           </w:p>
         </w:tc>
@@ -3316,7 +2617,7 @@
                 <w:sz w:val="20"/>
                 <w:szCs w:val="20"/>
               </w:rPr>
-              <w:t xml:space="preserve">Legal Entity</w:t>
+              <w:t xml:space="preserve">Email address and username</w:t>
             </w:r>
           </w:p>
         </w:tc>
@@ -3346,7 +2647,7 @@
                 <w:sz w:val="20"/>
                 <w:szCs w:val="20"/>
               </w:rPr>
-              <w:t xml:space="preserve">BetsPlug B.V.</w:t>
+              <w:t xml:space="preserve">Required to log in and manage the account</w:t>
             </w:r>
           </w:p>
         </w:tc>
@@ -3378,7 +2679,7 @@
                 <w:sz w:val="20"/>
                 <w:szCs w:val="20"/>
               </w:rPr>
-              <w:t xml:space="preserve">Website</w:t>
+              <w:t xml:space="preserve">Subscription status</w:t>
             </w:r>
           </w:p>
         </w:tc>
@@ -3408,7 +2709,7 @@
                 <w:sz w:val="20"/>
                 <w:szCs w:val="20"/>
               </w:rPr>
-              <w:t xml:space="preserve">https://betsplug.com</w:t>
+              <w:t xml:space="preserve">To determine which content is accessible</w:t>
             </w:r>
           </w:p>
         </w:tc>
@@ -3440,7 +2741,7 @@
                 <w:sz w:val="20"/>
                 <w:szCs w:val="20"/>
               </w:rPr>
-              <w:t xml:space="preserve">Technical Contact</w:t>
+              <w:t xml:space="preserve">Payment details (credit card, IBAN)</w:t>
             </w:r>
           </w:p>
         </w:tc>
@@ -3470,7 +2771,7 @@
                 <w:sz w:val="20"/>
                 <w:szCs w:val="20"/>
               </w:rPr>
-              <w:t xml:space="preserve">Via contact page</w:t>
+              <w:t xml:space="preserve">NOT stored by BetsPlug — Stripe processes all payments</w:t>
             </w:r>
           </w:p>
         </w:tc>
@@ -3502,7 +2803,7 @@
                 <w:sz w:val="20"/>
                 <w:szCs w:val="20"/>
               </w:rPr>
-              <w:t xml:space="preserve">Data Protection</w:t>
+              <w:t xml:space="preserve">Prediction history</w:t>
             </w:r>
           </w:p>
         </w:tc>
@@ -3532,7 +2833,606 @@
                 <w:sz w:val="20"/>
                 <w:szCs w:val="20"/>
               </w:rPr>
-              <w:t xml:space="preserve">GDPR requests via contact page</w:t>
+              <w:t xml:space="preserve">To display the track record and deliver the service</w:t>
+            </w:r>
+          </w:p>
+        </w:tc>
+      </w:tr>
+    </w:tbl>
+    <w:p>
+      <w:pPr>
+        <w:pStyle w:val="ListParagraph"/>
+        <w:numPr>
+          <w:ilvl w:val="0"/>
+          <w:numId w:val="2"/>
+        </w:numPr>
+        <w:spacing w:after="80" w:line="320"/>
+      </w:pPr>
+      <w:r>
+        <w:rPr>
+          <w:rFonts w:ascii="Arial" w:cs="Arial" w:eastAsia="Arial" w:hAnsi="Arial"/>
+          <w:sz w:val="22"/>
+          <w:szCs w:val="22"/>
+        </w:rPr>
+        <w:t xml:space="preserve">Right to erasure: you can have your account and all data deleted via settings or a GDPR request</w:t>
+      </w:r>
+    </w:p>
+    <w:p>
+      <w:pPr>
+        <w:pStyle w:val="ListParagraph"/>
+        <w:numPr>
+          <w:ilvl w:val="0"/>
+          <w:numId w:val="2"/>
+        </w:numPr>
+        <w:spacing w:after="80" w:line="320"/>
+      </w:pPr>
+      <w:r>
+        <w:rPr>
+          <w:rFonts w:ascii="Arial" w:cs="Arial" w:eastAsia="Arial" w:hAnsi="Arial"/>
+          <w:sz w:val="22"/>
+          <w:szCs w:val="22"/>
+        </w:rPr>
+        <w:t xml:space="preserve">Data processing takes place on European servers (Railway EU, Vercel EU)</w:t>
+      </w:r>
+    </w:p>
+    <w:p>
+      <w:pPr>
+        <w:pStyle w:val="ListParagraph"/>
+        <w:numPr>
+          <w:ilvl w:val="0"/>
+          <w:numId w:val="2"/>
+        </w:numPr>
+        <w:spacing w:after="80" w:line="320"/>
+      </w:pPr>
+      <w:r>
+        <w:rPr>
+          <w:rFonts w:ascii="Arial" w:cs="Arial" w:eastAsia="Arial" w:hAnsi="Arial"/>
+          <w:sz w:val="22"/>
+          <w:szCs w:val="22"/>
+        </w:rPr>
+        <w:t xml:space="preserve">No profiling or automated decision-making affecting users takes place</w:t>
+      </w:r>
+    </w:p>
+    <w:p>
+      <w:pPr>
+        <w:shd w:fill="f5f5f5" w:val="clear"/>
+        <w:spacing w:after="160" w:before="80" w:line="320"/>
+        <w:ind w:left="200" w:right="200"/>
+      </w:pPr>
+      <w:r>
+        <w:rPr>
+          <w:rFonts w:ascii="Arial" w:cs="Arial" w:eastAsia="Arial" w:hAnsi="Arial"/>
+          <w:b/>
+          <w:bCs/>
+          <w:color w:val="1a365d"/>
+          <w:sz w:val="20"/>
+          <w:szCs w:val="20"/>
+        </w:rPr>
+        <w:t xml:space="preserve">In plain terms: </w:t>
+      </w:r>
+      <w:r>
+        <w:rPr>
+          <w:rFonts w:ascii="Arial" w:cs="Arial" w:eastAsia="Arial" w:hAnsi="Arial"/>
+          <w:color w:val="444444"/>
+          <w:sz w:val="20"/>
+          <w:szCs w:val="20"/>
+        </w:rPr>
+        <w:t xml:space="preserve">In simple terms: BetsPlug knows your email address and what subscription you have. Your credit card details are processed by Stripe — BetsPlug never sees or stores them. You can have all your data deleted at any time.</w:t>
+      </w:r>
+    </w:p>
+    <w:p>
+      <w:pPr>
+        <w:pStyle w:val="Heading2"/>
+        <w:spacing w:after="160" w:before="280"/>
+      </w:pPr>
+      <w:r>
+        <w:rPr>
+          <w:rFonts w:ascii="Arial" w:cs="Arial" w:eastAsia="Arial" w:hAnsi="Arial"/>
+          <w:b/>
+          <w:bCs/>
+          <w:color w:val="1a365d"/>
+          <w:sz w:val="26"/>
+          <w:szCs w:val="26"/>
+        </w:rPr>
+        <w:t xml:space="preserve">5.4 Intellectual Property and Licences</w:t>
+      </w:r>
+    </w:p>
+    <w:p>
+      <w:pPr>
+        <w:spacing w:after="140" w:line="320"/>
+      </w:pPr>
+      <w:r>
+        <w:rPr>
+          <w:rFonts w:ascii="Arial" w:cs="Arial" w:eastAsia="Arial" w:hAnsi="Arial"/>
+          <w:sz w:val="22"/>
+          <w:szCs w:val="22"/>
+        </w:rPr>
+        <w:t xml:space="preserve">The prediction system is entirely developed in-house. The data on which the system runs is licensed from professional data providers:</w:t>
+      </w:r>
+    </w:p>
+    <w:p>
+      <w:pPr>
+        <w:pStyle w:val="ListParagraph"/>
+        <w:numPr>
+          <w:ilvl w:val="0"/>
+          <w:numId w:val="2"/>
+        </w:numPr>
+        <w:spacing w:after="80" w:line="320"/>
+      </w:pPr>
+      <w:r>
+        <w:rPr>
+          <w:rFonts w:ascii="Arial" w:cs="Arial" w:eastAsia="Arial" w:hAnsi="Arial"/>
+          <w:sz w:val="22"/>
+          <w:szCs w:val="22"/>
+        </w:rPr>
+        <w:t xml:space="preserve">API-Football (Pro licence): provides match data, results, team statistics</w:t>
+      </w:r>
+    </w:p>
+    <w:p>
+      <w:pPr>
+        <w:pStyle w:val="ListParagraph"/>
+        <w:numPr>
+          <w:ilvl w:val="0"/>
+          <w:numId w:val="2"/>
+        </w:numPr>
+        <w:spacing w:after="80" w:line="320"/>
+      </w:pPr>
+      <w:r>
+        <w:rPr>
+          <w:rFonts w:ascii="Arial" w:cs="Arial" w:eastAsia="Arial" w:hAnsi="Arial"/>
+          <w:sz w:val="22"/>
+          <w:szCs w:val="22"/>
+        </w:rPr>
+        <w:t xml:space="preserve">Football-Data.org: supplementary league data</w:t>
+      </w:r>
+    </w:p>
+    <w:p>
+      <w:pPr>
+        <w:pStyle w:val="ListParagraph"/>
+        <w:numPr>
+          <w:ilvl w:val="0"/>
+          <w:numId w:val="2"/>
+        </w:numPr>
+        <w:spacing w:after="80" w:line="320"/>
+      </w:pPr>
+      <w:r>
+        <w:rPr>
+          <w:rFonts w:ascii="Arial" w:cs="Arial" w:eastAsia="Arial" w:hAnsi="Arial"/>
+          <w:sz w:val="22"/>
+          <w:szCs w:val="22"/>
+        </w:rPr>
+        <w:t xml:space="preserve">The Odds API: provides bookmaker odds from 40+ providers</w:t>
+      </w:r>
+    </w:p>
+    <w:p>
+      <w:pPr>
+        <w:spacing w:after="140" w:line="320"/>
+      </w:pPr>
+      <w:r>
+        <w:rPr>
+          <w:rFonts w:ascii="Arial" w:cs="Arial" w:eastAsia="Arial" w:hAnsi="Arial"/>
+          <w:sz w:val="22"/>
+          <w:szCs w:val="22"/>
+        </w:rPr>
+        <w:t xml:space="preserve">All data is used within the terms of the respective licences.</w:t>
+      </w:r>
+    </w:p>
+    <w:p>
+      <w:pPr>
+        <w:pStyle w:val="Heading1"/>
+        <w:spacing w:after="200" w:before="360"/>
+      </w:pPr>
+      <w:r>
+        <w:rPr>
+          <w:rFonts w:ascii="Arial" w:cs="Arial" w:eastAsia="Arial" w:hAnsi="Arial"/>
+          <w:b/>
+          <w:bCs/>
+          <w:color w:val="1a365d"/>
+          <w:sz w:val="32"/>
+          <w:szCs w:val="32"/>
+        </w:rPr>
+        <w:t xml:space="preserve">6. Risk Disclosure</w:t>
+      </w:r>
+    </w:p>
+    <w:p>
+      <w:pPr>
+        <w:spacing w:after="140" w:line="320"/>
+      </w:pPr>
+      <w:r>
+        <w:rPr>
+          <w:rFonts w:ascii="Arial" w:cs="Arial" w:eastAsia="Arial" w:hAnsi="Arial"/>
+          <w:sz w:val="22"/>
+          <w:szCs w:val="22"/>
+        </w:rPr>
+        <w:t xml:space="preserve">It is essential that users and stakeholders understand the system’s limitations:</w:t>
+      </w:r>
+    </w:p>
+    <w:p>
+      <w:pPr>
+        <w:pStyle w:val="ListParagraph"/>
+        <w:numPr>
+          <w:ilvl w:val="0"/>
+          <w:numId w:val="2"/>
+        </w:numPr>
+        <w:spacing w:after="80" w:line="320"/>
+      </w:pPr>
+      <w:r>
+        <w:rPr>
+          <w:rFonts w:ascii="Arial" w:cs="Arial" w:eastAsia="Arial" w:hAnsi="Arial"/>
+          <w:sz w:val="22"/>
+          <w:szCs w:val="22"/>
+        </w:rPr>
+        <w:t xml:space="preserve">Predictions are estimates based on historical patterns — not certainties. Football is unpredictable and surprises are inevitable.</w:t>
+      </w:r>
+    </w:p>
+    <w:p>
+      <w:pPr>
+        <w:pStyle w:val="ListParagraph"/>
+        <w:numPr>
+          <w:ilvl w:val="0"/>
+          <w:numId w:val="2"/>
+        </w:numPr>
+        <w:spacing w:after="80" w:line="320"/>
+      </w:pPr>
+      <w:r>
+        <w:rPr>
+          <w:rFonts w:ascii="Arial" w:cs="Arial" w:eastAsia="Arial" w:hAnsi="Arial"/>
+          <w:sz w:val="22"/>
+          <w:szCs w:val="22"/>
+        </w:rPr>
+        <w:t xml:space="preserve">The system scoring 49% in the past does not mean it will score the same in the future. Circumstances change.</w:t>
+      </w:r>
+    </w:p>
+    <w:p>
+      <w:pPr>
+        <w:pStyle w:val="ListParagraph"/>
+        <w:numPr>
+          <w:ilvl w:val="0"/>
+          <w:numId w:val="2"/>
+        </w:numPr>
+        <w:spacing w:after="80" w:line="320"/>
+      </w:pPr>
+      <w:r>
+        <w:rPr>
+          <w:rFonts w:ascii="Arial" w:cs="Arial" w:eastAsia="Arial" w:hAnsi="Arial"/>
+          <w:sz w:val="22"/>
+          <w:szCs w:val="22"/>
+        </w:rPr>
+        <w:t xml:space="preserve">The model may underperform during unusual situations, such as pandemics, strikes, or drastic rule changes.</w:t>
+      </w:r>
+    </w:p>
+    <w:p>
+      <w:pPr>
+        <w:pStyle w:val="ListParagraph"/>
+        <w:numPr>
+          <w:ilvl w:val="0"/>
+          <w:numId w:val="2"/>
+        </w:numPr>
+        <w:spacing w:after="80" w:line="320"/>
+      </w:pPr>
+      <w:r>
+        <w:rPr>
+          <w:rFonts w:ascii="Arial" w:cs="Arial" w:eastAsia="Arial" w:hAnsi="Arial"/>
+          <w:sz w:val="22"/>
+          <w:szCs w:val="22"/>
+        </w:rPr>
+        <w:t xml:space="preserve">Accuracy varies by league: top-6 European leagues score around 50%, while smaller leagues score around 40%.</w:t>
+      </w:r>
+    </w:p>
+    <w:p>
+      <w:pPr>
+        <w:pStyle w:val="ListParagraph"/>
+        <w:numPr>
+          <w:ilvl w:val="0"/>
+          <w:numId w:val="2"/>
+        </w:numPr>
+        <w:spacing w:after="80" w:line="320"/>
+      </w:pPr>
+      <w:r>
+        <w:rPr>
+          <w:rFonts w:ascii="Arial" w:cs="Arial" w:eastAsia="Arial" w:hAnsi="Arial"/>
+          <w:sz w:val="22"/>
+          <w:szCs w:val="22"/>
+        </w:rPr>
+        <w:t xml:space="preserve">Never use information from BetsPlug as the sole basis for financial decisions. Never stake money you cannot afford to lose.</w:t>
+      </w:r>
+    </w:p>
+    <w:p>
+      <w:pPr>
+        <w:pStyle w:val="ListParagraph"/>
+        <w:numPr>
+          <w:ilvl w:val="0"/>
+          <w:numId w:val="2"/>
+        </w:numPr>
+        <w:spacing w:after="80" w:line="320"/>
+      </w:pPr>
+      <w:r>
+        <w:rPr>
+          <w:rFonts w:ascii="Arial" w:cs="Arial" w:eastAsia="Arial" w:hAnsi="Arial"/>
+          <w:sz w:val="22"/>
+          <w:szCs w:val="22"/>
+        </w:rPr>
+        <w:t xml:space="preserve">BetsPlug accepts no liability whatsoever for financial losses arising from the use of its predictions.</w:t>
+      </w:r>
+    </w:p>
+    <w:p>
+      <w:pPr>
+        <w:shd w:fill="f5f5f5" w:val="clear"/>
+        <w:spacing w:after="160" w:before="80" w:line="320"/>
+        <w:ind w:left="200" w:right="200"/>
+      </w:pPr>
+      <w:r>
+        <w:rPr>
+          <w:rFonts w:ascii="Arial" w:cs="Arial" w:eastAsia="Arial" w:hAnsi="Arial"/>
+          <w:b/>
+          <w:bCs/>
+          <w:color w:val="1a365d"/>
+          <w:sz w:val="20"/>
+          <w:szCs w:val="20"/>
+        </w:rPr>
+        <w:t xml:space="preserve">In plain terms: </w:t>
+      </w:r>
+      <w:r>
+        <w:rPr>
+          <w:rFonts w:ascii="Arial" w:cs="Arial" w:eastAsia="Arial" w:hAnsi="Arial"/>
+          <w:color w:val="444444"/>
+          <w:sz w:val="20"/>
+          <w:szCs w:val="20"/>
+        </w:rPr>
+        <w:t xml:space="preserve">Compare it to a weather forecast: 70% chance of rain means it does NOT rain in 3 out of 10 cases. Even the best forecast is not a guarantee. BetsPlug works the same way — it provides probabilities, not certainties.</w:t>
+      </w:r>
+    </w:p>
+    <w:p>
+      <w:pPr>
+        <w:pStyle w:val="Heading1"/>
+        <w:spacing w:after="200" w:before="360"/>
+      </w:pPr>
+      <w:r>
+        <w:rPr>
+          <w:rFonts w:ascii="Arial" w:cs="Arial" w:eastAsia="Arial" w:hAnsi="Arial"/>
+          <w:b/>
+          <w:bCs/>
+          <w:color w:val="1a365d"/>
+          <w:sz w:val="32"/>
+          <w:szCs w:val="32"/>
+        </w:rPr>
+        <w:t xml:space="preserve">7. Audit Trail &amp; Traceability</w:t>
+      </w:r>
+    </w:p>
+    <w:p>
+      <w:pPr>
+        <w:spacing w:after="140" w:line="320"/>
+      </w:pPr>
+      <w:r>
+        <w:rPr>
+          <w:rFonts w:ascii="Arial" w:cs="Arial" w:eastAsia="Arial" w:hAnsi="Arial"/>
+          <w:sz w:val="22"/>
+          <w:szCs w:val="22"/>
+        </w:rPr>
+        <w:t xml:space="preserve">Every prediction BetsPlug makes is permanently stored with all underlying data. This makes it possible to trace exactly how a prediction was made after the fact:</w:t>
+      </w:r>
+    </w:p>
+    <w:p>
+      <w:pPr>
+        <w:pStyle w:val="ListParagraph"/>
+        <w:numPr>
+          <w:ilvl w:val="0"/>
+          <w:numId w:val="2"/>
+        </w:numPr>
+        <w:spacing w:after="80" w:line="320"/>
+      </w:pPr>
+      <w:r>
+        <w:rPr>
+          <w:rFonts w:ascii="Arial" w:cs="Arial" w:eastAsia="Arial" w:hAnsi="Arial"/>
+          <w:sz w:val="22"/>
+          <w:szCs w:val="22"/>
+        </w:rPr>
+        <w:t xml:space="preserve">Timestamp: when the prediction was made (proof it was before the match)</w:t>
+      </w:r>
+    </w:p>
+    <w:p>
+      <w:pPr>
+        <w:pStyle w:val="ListParagraph"/>
+        <w:numPr>
+          <w:ilvl w:val="0"/>
+          <w:numId w:val="2"/>
+        </w:numPr>
+        <w:spacing w:after="80" w:line="320"/>
+      </w:pPr>
+      <w:r>
+        <w:rPr>
+          <w:rFonts w:ascii="Arial" w:cs="Arial" w:eastAsia="Arial" w:hAnsi="Arial"/>
+          <w:sz w:val="22"/>
+          <w:szCs w:val="22"/>
+        </w:rPr>
+        <w:t xml:space="preserve">Model version: which version of the system made the prediction</w:t>
+      </w:r>
+    </w:p>
+    <w:p>
+      <w:pPr>
+        <w:pStyle w:val="ListParagraph"/>
+        <w:numPr>
+          <w:ilvl w:val="0"/>
+          <w:numId w:val="2"/>
+        </w:numPr>
+        <w:spacing w:after="80" w:line="320"/>
+      </w:pPr>
+      <w:r>
+        <w:rPr>
+          <w:rFonts w:ascii="Arial" w:cs="Arial" w:eastAsia="Arial" w:hAnsi="Arial"/>
+          <w:sz w:val="22"/>
+          <w:szCs w:val="22"/>
+        </w:rPr>
+        <w:t xml:space="preserve">Feature snapshot: all 43 data points used at that moment</w:t>
+      </w:r>
+    </w:p>
+    <w:p>
+      <w:pPr>
+        <w:pStyle w:val="ListParagraph"/>
+        <w:numPr>
+          <w:ilvl w:val="0"/>
+          <w:numId w:val="2"/>
+        </w:numPr>
+        <w:spacing w:after="80" w:line="320"/>
+      </w:pPr>
+      <w:r>
+        <w:rPr>
+          <w:rFonts w:ascii="Arial" w:cs="Arial" w:eastAsia="Arial" w:hAnsi="Arial"/>
+          <w:sz w:val="22"/>
+          <w:szCs w:val="22"/>
+        </w:rPr>
+        <w:t xml:space="preserve">Raw model output: the exact calculations from each model</w:t>
+      </w:r>
+    </w:p>
+    <w:p>
+      <w:pPr>
+        <w:pStyle w:val="ListParagraph"/>
+        <w:numPr>
+          <w:ilvl w:val="0"/>
+          <w:numId w:val="2"/>
+        </w:numPr>
+        <w:spacing w:after="80" w:line="320"/>
+      </w:pPr>
+      <w:r>
+        <w:rPr>
+          <w:rFonts w:ascii="Arial" w:cs="Arial" w:eastAsia="Arial" w:hAnsi="Arial"/>
+          <w:sz w:val="22"/>
+          <w:szCs w:val="22"/>
+        </w:rPr>
+        <w:t xml:space="preserve">Evaluation record: the comparison with the actual match outcome</w:t>
+      </w:r>
+    </w:p>
+    <w:p>
+      <w:pPr>
+        <w:spacing w:after="140" w:line="320"/>
+      </w:pPr>
+      <w:r>
+        <w:rPr>
+          <w:rFonts w:ascii="Arial" w:cs="Arial" w:eastAsia="Arial" w:hAnsi="Arial"/>
+          <w:sz w:val="22"/>
+          <w:szCs w:val="22"/>
+        </w:rPr>
+        <w:t xml:space="preserve">All this data is reproducible: given the same input, you get the same output. All changes to the system are tracked in a version control system (git).</w:t>
+      </w:r>
+    </w:p>
+    <w:p>
+      <w:pPr>
+        <w:shd w:fill="f5f5f5" w:val="clear"/>
+        <w:spacing w:after="160" w:before="80" w:line="320"/>
+        <w:ind w:left="200" w:right="200"/>
+      </w:pPr>
+      <w:r>
+        <w:rPr>
+          <w:rFonts w:ascii="Arial" w:cs="Arial" w:eastAsia="Arial" w:hAnsi="Arial"/>
+          <w:b/>
+          <w:bCs/>
+          <w:color w:val="1a365d"/>
+          <w:sz w:val="20"/>
+          <w:szCs w:val="20"/>
+        </w:rPr>
+        <w:t xml:space="preserve">In plain terms: </w:t>
+      </w:r>
+      <w:r>
+        <w:rPr>
+          <w:rFonts w:ascii="Arial" w:cs="Arial" w:eastAsia="Arial" w:hAnsi="Arial"/>
+          <w:color w:val="444444"/>
+          <w:sz w:val="20"/>
+          <w:szCs w:val="20"/>
+        </w:rPr>
+        <w:t xml:space="preserve">This means an auditor or regulator can verify at any time: (1) when a prediction was made, (2) based on what data, (3) whether that data was fair, and (4) whether the prediction was correct. Nothing can be altered after the fact.</w:t>
+      </w:r>
+    </w:p>
+    <w:p>
+      <w:pPr>
+        <w:pStyle w:val="Heading1"/>
+        <w:spacing w:after="200" w:before="360"/>
+      </w:pPr>
+      <w:r>
+        <w:rPr>
+          <w:rFonts w:ascii="Arial" w:cs="Arial" w:eastAsia="Arial" w:hAnsi="Arial"/>
+          <w:b/>
+          <w:bCs/>
+          <w:color w:val="1a365d"/>
+          <w:sz w:val="32"/>
+          <w:szCs w:val="32"/>
+        </w:rPr>
+        <w:t xml:space="preserve">8. Contact &amp; Governance</w:t>
+      </w:r>
+    </w:p>
+    <w:tbl>
+      <w:tblPr>
+        <w:tblW w:type="dxa" w:w="9026"/>
+        <w:tblBorders>
+          <w:top w:val="single" w:color="auto" w:sz="4"/>
+          <w:left w:val="single" w:color="auto" w:sz="4"/>
+          <w:bottom w:val="single" w:color="auto" w:sz="4"/>
+          <w:right w:val="single" w:color="auto" w:sz="4"/>
+          <w:insideH w:val="single" w:color="auto" w:sz="4"/>
+          <w:insideV w:val="single" w:color="auto" w:sz="4"/>
+        </w:tblBorders>
+      </w:tblPr>
+      <w:tblGrid>
+        <w:gridCol w:w="4500"/>
+        <w:gridCol w:w="4526"/>
+      </w:tblGrid>
+      <w:tr>
+        <w:tc>
+          <w:tcPr>
+            <w:tcW w:type="dxa" w:w="4500"/>
+            <w:tcBorders>
+              <w:top w:val="single" w:color="cccccc" w:sz="1"/>
+              <w:left w:val="single" w:color="cccccc" w:sz="1"/>
+              <w:bottom w:val="single" w:color="cccccc" w:sz="1"/>
+              <w:right w:val="single" w:color="cccccc" w:sz="1"/>
+            </w:tcBorders>
+            <w:shd w:fill="e8f0fe" w:val="clear"/>
+            <w:tcMar>
+              <w:top w:type="dxa" w:w="80"/>
+              <w:left w:type="dxa" w:w="120"/>
+              <w:bottom w:type="dxa" w:w="80"/>
+              <w:right w:type="dxa" w:w="120"/>
+            </w:tcMar>
+          </w:tcPr>
+          <w:p>
+            <w:r>
+              <w:rPr>
+                <w:rFonts w:ascii="Arial" w:cs="Arial" w:eastAsia="Arial" w:hAnsi="Arial"/>
+                <w:b/>
+                <w:bCs/>
+                <w:sz w:val="20"/>
+                <w:szCs w:val="20"/>
+              </w:rPr>
+              <w:t xml:space="preserve">Item</w:t>
+            </w:r>
+          </w:p>
+        </w:tc>
+        <w:tc>
+          <w:tcPr>
+            <w:tcW w:type="dxa" w:w="4526"/>
+            <w:tcBorders>
+              <w:top w:val="single" w:color="cccccc" w:sz="1"/>
+              <w:left w:val="single" w:color="cccccc" w:sz="1"/>
+              <w:bottom w:val="single" w:color="cccccc" w:sz="1"/>
+              <w:right w:val="single" w:color="cccccc" w:sz="1"/>
+            </w:tcBorders>
+            <w:shd w:fill="e8f0fe" w:val="clear"/>
+            <w:tcMar>
+              <w:top w:type="dxa" w:w="80"/>
+              <w:left w:type="dxa" w:w="120"/>
+              <w:bottom w:type="dxa" w:w="80"/>
+              <w:right w:type="dxa" w:w="120"/>
+            </w:tcMar>
+          </w:tcPr>
+          <w:p>
+            <w:r>
+              <w:rPr>
+                <w:rFonts w:ascii="Arial" w:cs="Arial" w:eastAsia="Arial" w:hAnsi="Arial"/>
+                <w:b/>
+                <w:bCs/>
+                <w:sz w:val="20"/>
+                <w:szCs w:val="20"/>
+              </w:rPr>
+              <w:t xml:space="preserve">Details</w:t>
             </w:r>
           </w:p>
         </w:tc>
@@ -3564,7 +3464,255 @@
                 <w:sz w:val="20"/>
                 <w:szCs w:val="20"/>
               </w:rPr>
-              <w:t xml:space="preserve">Document Version</w:t>
+              <w:t xml:space="preserve">Legal entity</w:t>
+            </w:r>
+          </w:p>
+        </w:tc>
+        <w:tc>
+          <w:tcPr>
+            <w:tcW w:type="dxa" w:w="4526"/>
+            <w:tcBorders>
+              <w:top w:val="single" w:color="cccccc" w:sz="1"/>
+              <w:left w:val="single" w:color="cccccc" w:sz="1"/>
+              <w:bottom w:val="single" w:color="cccccc" w:sz="1"/>
+              <w:right w:val="single" w:color="cccccc" w:sz="1"/>
+            </w:tcBorders>
+            <w:shd w:fill="ffffff" w:val="clear"/>
+            <w:tcMar>
+              <w:top w:type="dxa" w:w="80"/>
+              <w:left w:type="dxa" w:w="120"/>
+              <w:bottom w:type="dxa" w:w="80"/>
+              <w:right w:type="dxa" w:w="120"/>
+            </w:tcMar>
+          </w:tcPr>
+          <w:p>
+            <w:r>
+              <w:rPr>
+                <w:rFonts w:ascii="Arial" w:cs="Arial" w:eastAsia="Arial" w:hAnsi="Arial"/>
+                <w:b w:val="false"/>
+                <w:bCs w:val="false"/>
+                <w:sz w:val="20"/>
+                <w:szCs w:val="20"/>
+              </w:rPr>
+              <w:t xml:space="preserve">BetsPlug B.V.</w:t>
+            </w:r>
+          </w:p>
+        </w:tc>
+      </w:tr>
+      <w:tr>
+        <w:tc>
+          <w:tcPr>
+            <w:tcW w:type="dxa" w:w="4500"/>
+            <w:tcBorders>
+              <w:top w:val="single" w:color="cccccc" w:sz="1"/>
+              <w:left w:val="single" w:color="cccccc" w:sz="1"/>
+              <w:bottom w:val="single" w:color="cccccc" w:sz="1"/>
+              <w:right w:val="single" w:color="cccccc" w:sz="1"/>
+            </w:tcBorders>
+            <w:shd w:fill="ffffff" w:val="clear"/>
+            <w:tcMar>
+              <w:top w:type="dxa" w:w="80"/>
+              <w:left w:type="dxa" w:w="120"/>
+              <w:bottom w:type="dxa" w:w="80"/>
+              <w:right w:type="dxa" w:w="120"/>
+            </w:tcMar>
+          </w:tcPr>
+          <w:p>
+            <w:r>
+              <w:rPr>
+                <w:rFonts w:ascii="Arial" w:cs="Arial" w:eastAsia="Arial" w:hAnsi="Arial"/>
+                <w:b w:val="false"/>
+                <w:bCs w:val="false"/>
+                <w:sz w:val="20"/>
+                <w:szCs w:val="20"/>
+              </w:rPr>
+              <w:t xml:space="preserve">Website</w:t>
+            </w:r>
+          </w:p>
+        </w:tc>
+        <w:tc>
+          <w:tcPr>
+            <w:tcW w:type="dxa" w:w="4526"/>
+            <w:tcBorders>
+              <w:top w:val="single" w:color="cccccc" w:sz="1"/>
+              <w:left w:val="single" w:color="cccccc" w:sz="1"/>
+              <w:bottom w:val="single" w:color="cccccc" w:sz="1"/>
+              <w:right w:val="single" w:color="cccccc" w:sz="1"/>
+            </w:tcBorders>
+            <w:shd w:fill="ffffff" w:val="clear"/>
+            <w:tcMar>
+              <w:top w:type="dxa" w:w="80"/>
+              <w:left w:type="dxa" w:w="120"/>
+              <w:bottom w:type="dxa" w:w="80"/>
+              <w:right w:type="dxa" w:w="120"/>
+            </w:tcMar>
+          </w:tcPr>
+          <w:p>
+            <w:r>
+              <w:rPr>
+                <w:rFonts w:ascii="Arial" w:cs="Arial" w:eastAsia="Arial" w:hAnsi="Arial"/>
+                <w:b w:val="false"/>
+                <w:bCs w:val="false"/>
+                <w:sz w:val="20"/>
+                <w:szCs w:val="20"/>
+              </w:rPr>
+              <w:t xml:space="preserve">https://betsplug.com</w:t>
+            </w:r>
+          </w:p>
+        </w:tc>
+      </w:tr>
+      <w:tr>
+        <w:tc>
+          <w:tcPr>
+            <w:tcW w:type="dxa" w:w="4500"/>
+            <w:tcBorders>
+              <w:top w:val="single" w:color="cccccc" w:sz="1"/>
+              <w:left w:val="single" w:color="cccccc" w:sz="1"/>
+              <w:bottom w:val="single" w:color="cccccc" w:sz="1"/>
+              <w:right w:val="single" w:color="cccccc" w:sz="1"/>
+            </w:tcBorders>
+            <w:shd w:fill="ffffff" w:val="clear"/>
+            <w:tcMar>
+              <w:top w:type="dxa" w:w="80"/>
+              <w:left w:type="dxa" w:w="120"/>
+              <w:bottom w:type="dxa" w:w="80"/>
+              <w:right w:type="dxa" w:w="120"/>
+            </w:tcMar>
+          </w:tcPr>
+          <w:p>
+            <w:r>
+              <w:rPr>
+                <w:rFonts w:ascii="Arial" w:cs="Arial" w:eastAsia="Arial" w:hAnsi="Arial"/>
+                <w:b w:val="false"/>
+                <w:bCs w:val="false"/>
+                <w:sz w:val="20"/>
+                <w:szCs w:val="20"/>
+              </w:rPr>
+              <w:t xml:space="preserve">Technical contact</w:t>
+            </w:r>
+          </w:p>
+        </w:tc>
+        <w:tc>
+          <w:tcPr>
+            <w:tcW w:type="dxa" w:w="4526"/>
+            <w:tcBorders>
+              <w:top w:val="single" w:color="cccccc" w:sz="1"/>
+              <w:left w:val="single" w:color="cccccc" w:sz="1"/>
+              <w:bottom w:val="single" w:color="cccccc" w:sz="1"/>
+              <w:right w:val="single" w:color="cccccc" w:sz="1"/>
+            </w:tcBorders>
+            <w:shd w:fill="ffffff" w:val="clear"/>
+            <w:tcMar>
+              <w:top w:type="dxa" w:w="80"/>
+              <w:left w:type="dxa" w:w="120"/>
+              <w:bottom w:type="dxa" w:w="80"/>
+              <w:right w:type="dxa" w:w="120"/>
+            </w:tcMar>
+          </w:tcPr>
+          <w:p>
+            <w:r>
+              <w:rPr>
+                <w:rFonts w:ascii="Arial" w:cs="Arial" w:eastAsia="Arial" w:hAnsi="Arial"/>
+                <w:b w:val="false"/>
+                <w:bCs w:val="false"/>
+                <w:sz w:val="20"/>
+                <w:szCs w:val="20"/>
+              </w:rPr>
+              <w:t xml:space="preserve">Via the contact page on the website</w:t>
+            </w:r>
+          </w:p>
+        </w:tc>
+      </w:tr>
+      <w:tr>
+        <w:tc>
+          <w:tcPr>
+            <w:tcW w:type="dxa" w:w="4500"/>
+            <w:tcBorders>
+              <w:top w:val="single" w:color="cccccc" w:sz="1"/>
+              <w:left w:val="single" w:color="cccccc" w:sz="1"/>
+              <w:bottom w:val="single" w:color="cccccc" w:sz="1"/>
+              <w:right w:val="single" w:color="cccccc" w:sz="1"/>
+            </w:tcBorders>
+            <w:shd w:fill="ffffff" w:val="clear"/>
+            <w:tcMar>
+              <w:top w:type="dxa" w:w="80"/>
+              <w:left w:type="dxa" w:w="120"/>
+              <w:bottom w:type="dxa" w:w="80"/>
+              <w:right w:type="dxa" w:w="120"/>
+            </w:tcMar>
+          </w:tcPr>
+          <w:p>
+            <w:r>
+              <w:rPr>
+                <w:rFonts w:ascii="Arial" w:cs="Arial" w:eastAsia="Arial" w:hAnsi="Arial"/>
+                <w:b w:val="false"/>
+                <w:bCs w:val="false"/>
+                <w:sz w:val="20"/>
+                <w:szCs w:val="20"/>
+              </w:rPr>
+              <w:t xml:space="preserve">Privacy requests</w:t>
+            </w:r>
+          </w:p>
+        </w:tc>
+        <w:tc>
+          <w:tcPr>
+            <w:tcW w:type="dxa" w:w="4526"/>
+            <w:tcBorders>
+              <w:top w:val="single" w:color="cccccc" w:sz="1"/>
+              <w:left w:val="single" w:color="cccccc" w:sz="1"/>
+              <w:bottom w:val="single" w:color="cccccc" w:sz="1"/>
+              <w:right w:val="single" w:color="cccccc" w:sz="1"/>
+            </w:tcBorders>
+            <w:shd w:fill="ffffff" w:val="clear"/>
+            <w:tcMar>
+              <w:top w:type="dxa" w:w="80"/>
+              <w:left w:type="dxa" w:w="120"/>
+              <w:bottom w:type="dxa" w:w="80"/>
+              <w:right w:type="dxa" w:w="120"/>
+            </w:tcMar>
+          </w:tcPr>
+          <w:p>
+            <w:r>
+              <w:rPr>
+                <w:rFonts w:ascii="Arial" w:cs="Arial" w:eastAsia="Arial" w:hAnsi="Arial"/>
+                <w:b w:val="false"/>
+                <w:bCs w:val="false"/>
+                <w:sz w:val="20"/>
+                <w:szCs w:val="20"/>
+              </w:rPr>
+              <w:t xml:space="preserve">GDPR requests via the contact page</w:t>
+            </w:r>
+          </w:p>
+        </w:tc>
+      </w:tr>
+      <w:tr>
+        <w:tc>
+          <w:tcPr>
+            <w:tcW w:type="dxa" w:w="4500"/>
+            <w:tcBorders>
+              <w:top w:val="single" w:color="cccccc" w:sz="1"/>
+              <w:left w:val="single" w:color="cccccc" w:sz="1"/>
+              <w:bottom w:val="single" w:color="cccccc" w:sz="1"/>
+              <w:right w:val="single" w:color="cccccc" w:sz="1"/>
+            </w:tcBorders>
+            <w:shd w:fill="ffffff" w:val="clear"/>
+            <w:tcMar>
+              <w:top w:type="dxa" w:w="80"/>
+              <w:left w:type="dxa" w:w="120"/>
+              <w:bottom w:type="dxa" w:w="80"/>
+              <w:right w:type="dxa" w:w="120"/>
+            </w:tcMar>
+          </w:tcPr>
+          <w:p>
+            <w:r>
+              <w:rPr>
+                <w:rFonts w:ascii="Arial" w:cs="Arial" w:eastAsia="Arial" w:hAnsi="Arial"/>
+                <w:b w:val="false"/>
+                <w:bCs w:val="false"/>
+                <w:sz w:val="20"/>
+                <w:szCs w:val="20"/>
+              </w:rPr>
+              <w:t xml:space="preserve">Document version</w:t>
             </w:r>
           </w:p>
         </w:tc>
@@ -3607,7 +3755,7 @@
     </w:p>
     <w:p>
       <w:pPr>
-        <w:spacing w:after="120"/>
+        <w:spacing w:after="140" w:line="320"/>
       </w:pPr>
       <w:r>
         <w:rPr>
@@ -3618,7 +3766,7 @@
           <w:sz w:val="22"/>
           <w:szCs w:val="22"/>
         </w:rPr>
-        <w:t xml:space="preserve">— End of Document —</w:t>
+        <w:t xml:space="preserve">— End of document —</w:t>
       </w:r>
     </w:p>
     <w:sectPr>

</xml_diff>